<commit_message>
updated live search and usercourse page filters
</commit_message>
<xml_diff>
--- a/docs/jkthub-platform-prd-brd-user-stories.docx
+++ b/docs/jkthub-platform-prd-brd-user-stories.docx
@@ -1055,7 +1055,7 @@
         <w:spacing w:after="90"/>
       </w:pPr>
       <w:r>
-        <w:t xml:space="preserve">A student's public visibility (Showcase, achievement page) requires explicit parent (or Admin) consent — never student self-service and never automatic on publish-to-gallery.</w:t>
+        <w:t xml:space="preserve">A student's public visibility (Showcase, achievement/portfolio page) requires explicit consent and is never automatic on publish-to-gallery — a parent or Admin grants it for a school-linked/parent-linked student, while an independent student (no linked parent) may grant it to themselves.</w:t>
       </w:r>
     </w:p>
     <w:p>
@@ -3272,6 +3272,19 @@
     </w:p>
     <w:p>
       <w:pPr>
+        <w:pStyle w:val="ListParagraph"/>
+        <w:numPr>
+          <w:ilvl w:val="0"/>
+          <w:numId w:val="1"/>
+        </w:numPr>
+        <w:spacing w:after="90"/>
+      </w:pPr>
+      <w:r>
+        <w:t xml:space="preserve">Notes, video and slides stay open for studying beforehand, but lock the moment the student answers the quiz's first question — a prompt points them back to the quiz, which stays accessible throughout — and unlock again once the quiz is finished.</w:t>
+      </w:r>
+    </w:p>
+    <w:p>
+      <w:pPr>
         <w:pStyle w:val="Heading3"/>
         <w:spacing w:after="160" w:before="320"/>
       </w:pPr>
@@ -3290,6 +3303,19 @@
       </w:pPr>
       <w:r>
         <w:t xml:space="preserve">Take a quiz, get an immediate score plus a question-by-question review with an AI explanation on every answer.</w:t>
+      </w:r>
+    </w:p>
+    <w:p>
+      <w:pPr>
+        <w:pStyle w:val="ListParagraph"/>
+        <w:numPr>
+          <w:ilvl w:val="0"/>
+          <w:numId w:val="1"/>
+        </w:numPr>
+        <w:spacing w:after="90"/>
+      </w:pPr>
+      <w:r>
+        <w:t xml:space="preserve">A refreshed or reopened in-progress quiz resumes exactly where the student left off — already-answered questions are restored showing their checked/locked state — instead of restarting from question one.</w:t>
       </w:r>
     </w:p>
     <w:p>
@@ -3791,7 +3817,7 @@
         <w:spacing w:after="90"/>
       </w:pPr>
       <w:r>
-        <w:t xml:space="preserve">Browse the gallery filtered by lab type, sorted Newest/Popular, with incremental loading.</w:t>
+        <w:t xml:space="preserve">Browse the gallery filtered by lab type or searched by project name, sorted Newest/Popular, with incremental loading.</w:t>
       </w:r>
     </w:p>
     <w:p>
@@ -3805,6 +3831,19 @@
       </w:pPr>
       <w:r>
         <w:t xml:space="preserve">Like other students' projects (not your own); remix a published project into your own free-play slot (with an overwrite warning), tracked with a remix count.</w:t>
+      </w:r>
+    </w:p>
+    <w:p>
+      <w:pPr>
+        <w:pStyle w:val="ListParagraph"/>
+        <w:numPr>
+          <w:ilvl w:val="0"/>
+          <w:numId w:val="1"/>
+        </w:numPr>
+        <w:spacing w:after="90"/>
+      </w:pPr>
+      <w:r>
+        <w:t xml:space="preserve">A project's author name links to their public portfolio page when that student has public sharing enabled (same consent gate as §3.10).</w:t>
       </w:r>
     </w:p>
     <w:p>
@@ -4509,7 +4548,7 @@
           <w:sz w:val="20"/>
           <w:szCs w:val="20"/>
         </w:rPr>
-        <w:t xml:space="preserve">Student (subject), Parent (sole consent authority), Public Visitor (viewer)</w:t>
+        <w:t xml:space="preserve">Student (subject or self-service for independent students), Parent (consent authority for linked students), Public Visitor (viewer)</w:t>
       </w:r>
     </w:p>
     <w:p>
@@ -4521,7 +4560,7 @@
           <w:sz w:val="21"/>
           <w:szCs w:val="21"/>
         </w:rPr>
-        <w:t xml:space="preserve">A deliberate two-tier visibility model: the in-app Gallery only needs login; the public Showcase additionally requires parental consent, since it exposes a minor's work to the open internet.</w:t>
+        <w:t xml:space="preserve">A deliberate two-tier visibility model: the in-app Gallery only needs login; the public Showcase additionally requires explicit consent, since it exposes a minor's work to the open internet. The achievement page doubles as a public portfolio, combining badges/certificates with published gallery projects on one page.</w:t>
       </w:r>
     </w:p>
     <w:p>
@@ -4543,7 +4582,20 @@
         <w:spacing w:after="90"/>
       </w:pPr>
       <w:r>
-        <w:t xml:space="preserve">A student's project only appears on the public /showcase if a parent (or Admin) has explicitly enabled the child's public profile — the student cannot self-enable this.</w:t>
+        <w:t xml:space="preserve">A student's project only appears on the public /showcase if their public profile is enabled.</w:t>
+      </w:r>
+    </w:p>
+    <w:p>
+      <w:pPr>
+        <w:pStyle w:val="ListParagraph"/>
+        <w:numPr>
+          <w:ilvl w:val="0"/>
+          <w:numId w:val="1"/>
+        </w:numPr>
+        <w:spacing w:after="90"/>
+      </w:pPr>
+      <w:r>
+        <w:t xml:space="preserve">An independent student (no linked parent) can self-enable/disable their own public profile from their dashboard settings; a school-linked or parent-linked student still requires a parent or Admin to enable it on their behalf.</w:t>
       </w:r>
     </w:p>
     <w:p>
@@ -4578,20 +4630,20 @@
         <w:spacing w:after="90"/>
       </w:pPr>
       <w:r>
-        <w:t xml:space="preserve">Public Showcase: published Web/Blockly gallery projects plus admin-featured External Projects, shortened to 'First L.' names, with like counts and star ratings.</w:t>
-      </w:r>
-    </w:p>
-    <w:p>
-      <w:pPr>
-        <w:pStyle w:val="ListParagraph"/>
-        <w:numPr>
-          <w:ilvl w:val="0"/>
-          <w:numId w:val="1"/>
-        </w:numPr>
-        <w:spacing w:after="90"/>
-      </w:pPr>
-      <w:r>
-        <w:t xml:space="preserve">Public achievement page (/achievements/:slug, unguessable link): level, streak, badges, certificates under a cartoon avatar and shortened name.</w:t>
+        <w:t xml:space="preserve">Public Showcase: published Web/Blockly gallery projects plus admin-featured External Projects, shortened to 'First L.' names, with like counts and star ratings; filters live as you type/click, by project name and lab type, with no page reload, and links back to the author's portfolio page.</w:t>
+      </w:r>
+    </w:p>
+    <w:p>
+      <w:pPr>
+        <w:pStyle w:val="ListParagraph"/>
+        <w:numPr>
+          <w:ilvl w:val="0"/>
+          <w:numId w:val="1"/>
+        </w:numPr>
+        <w:spacing w:after="90"/>
+      </w:pPr>
+      <w:r>
+        <w:t xml:space="preserve">Public achievement/portfolio page (/achievements/:slug, unguessable link): level, streak, badges, certificates under a cartoon avatar and shortened name, plus a grid of that student's own published gallery projects.</w:t>
       </w:r>
     </w:p>
     <w:p>
@@ -5459,7 +5511,7 @@
         <w:spacing w:after="90"/>
       </w:pPr>
       <w:r>
-        <w:t xml:space="preserve">Course catalogue grouped by pathway; individual course/pathway detail pages with downloadable curriculum.</w:t>
+        <w:t xml:space="preserve">Course catalogue grouped by pathway; individual course/pathway detail pages with downloadable curriculum; searchable by course title from the site header nav, available on every public page.</w:t>
       </w:r>
     </w:p>
     <w:p>
@@ -5568,6 +5620,28 @@
           <w:szCs w:val="20"/>
         </w:rPr>
         <w:t xml:space="preserve">Admin</w:t>
+      </w:r>
+    </w:p>
+    <w:p>
+      <w:pPr>
+        <w:pStyle w:val="Heading3"/>
+        <w:spacing w:after="160" w:before="320"/>
+      </w:pPr>
+      <w:r>
+        <w:t xml:space="preserve">Global Search</w:t>
+      </w:r>
+    </w:p>
+    <w:p>
+      <w:pPr>
+        <w:pStyle w:val="ListParagraph"/>
+        <w:numPr>
+          <w:ilvl w:val="0"/>
+          <w:numId w:val="1"/>
+        </w:numPr>
+        <w:spacing w:after="90"/>
+      </w:pPr>
+      <w:r>
+        <w:t xml:space="preserve">Admin-only header search box, live-as-you-type suggestions (2+ characters) across Students, Courses and Schools, each result showing a key detail (e.g. a course's price) and deep-linking straight to its detail page; not shown to Instructors.</w:t>
       </w:r>
     </w:p>
     <w:p>

</xml_diff>

<commit_message>
Add coin-gated quiz retakes and average-score lab resubmission history
Retaking an already-submitted quiz now shows a coin-cost confirm popup
(15 coins) before re-opening it; a resubmitted lab task's displayed
score is now the average across every graded attempt, with each
attempt's own score also listed.

Co-Authored-By: Claude Sonnet 5 <noreply@anthropic.com>
</commit_message>
<xml_diff>
--- a/docs/jkthub-platform-prd-brd-user-stories.docx
+++ b/docs/jkthub-platform-prd-brd-user-stories.docx
@@ -3736,7 +3736,7 @@
         <w:spacing w:after="90"/>
       </w:pPr>
       <w:r>
-        <w:t xml:space="preserve">Lesson-attached lab tasks (Web/Blockly/Python/Arduino): AI grades on submit (score + feedback), up to 3 attempts, first submission pays XP and can unlock the next lesson.</w:t>
+        <w:t xml:space="preserve">Lesson-attached lab tasks (Web/Blockly/Python/Arduino): AI grades on submit (score + feedback), up to 3 attempts, first submission pays XP and can unlock the next lesson. The displayed score is the average across every graded attempt (not just the latest), with each attempt's own score also listed so the student can see the full breakdown.</w:t>
       </w:r>
     </w:p>
     <w:p>
@@ -4400,7 +4400,7 @@
         <w:spacing w:after="90"/>
       </w:pPr>
       <w:r>
-        <w:t xml:space="preserve">Spent in the Shop (banners, title tags, XP Boost), on avatar frames, quiz lifelines (hint/fifty-fifty), streak freezes, and Arcade games.</w:t>
+        <w:t xml:space="preserve">Spent in the Shop (banners, title tags, XP Boost), on avatar frames, quiz lifelines (hint/fifty-fifty), quiz retakes, streak freezes, and Arcade games.</w:t>
       </w:r>
     </w:p>
     <w:p>
@@ -4471,6 +4471,19 @@
       </w:pPr>
       <w:r>
         <w:t xml:space="preserve">AI hint (10 coins) and 50/50 (20 coins) during a quiz attempt.</w:t>
+      </w:r>
+    </w:p>
+    <w:p>
+      <w:pPr>
+        <w:pStyle w:val="ListParagraph"/>
+        <w:numPr>
+          <w:ilvl w:val="0"/>
+          <w:numId w:val="1"/>
+        </w:numPr>
+        <w:spacing w:after="90"/>
+      </w:pPr>
+      <w:r>
+        <w:t xml:space="preserve">Retaking an already-submitted quiz costs 15 coins, confirmed via a pop-up before it proceeds; unlimited retakes, but only the first attempt ever earns XP or the boss-battle coin bonus.</w:t>
       </w:r>
     </w:p>
     <w:p>
@@ -9205,7 +9218,7 @@
           <w:sz w:val="21"/>
           <w:szCs w:val="21"/>
         </w:rPr>
-        <w:t xml:space="preserve">I want to retake a quiz as many times as I want, </w:t>
+        <w:t xml:space="preserve">I want to retake a quiz as many times as I want, with a clear coin-cost warning before I commit, </w:t>
       </w:r>
       <w:r>
         <w:rPr>
@@ -9215,7 +9228,7 @@
           <w:sz w:val="21"/>
           <w:szCs w:val="21"/>
         </w:rPr>
-        <w:t xml:space="preserve">so that I can keep practicing until I've really mastered it, even though only my first attempt earns XP.</w:t>
+        <w:t xml:space="preserve">so that I can keep practicing until I've really mastered it, even though only my first attempt earns XP, and I'm never surprised by a coin charge.</w:t>
       </w:r>
     </w:p>
     <w:p>
@@ -9518,6 +9531,42 @@
           <w:szCs w:val="21"/>
         </w:rPr>
         <w:t xml:space="preserve">so that I know if my work meets the lesson's goal before moving on.</w:t>
+      </w:r>
+    </w:p>
+    <w:p>
+      <w:pPr>
+        <w:pStyle w:val="ListParagraph"/>
+        <w:numPr>
+          <w:ilvl w:val="0"/>
+          <w:numId w:val="1"/>
+        </w:numPr>
+        <w:spacing w:after="130" w:line="280"/>
+      </w:pPr>
+      <w:r>
+        <w:rPr>
+          <w:b/>
+          <w:bCs/>
+          <w:sz w:val="21"/>
+          <w:szCs w:val="21"/>
+        </w:rPr>
+        <w:t xml:space="preserve">As a Student, </w:t>
+      </w:r>
+      <w:r>
+        <w:rPr>
+          <w:sz w:val="21"/>
+          <w:szCs w:val="21"/>
+        </w:rPr>
+        <w:t xml:space="preserve">I want to resubmit a lab task up to the attempt limit and see my average score plus every attempt's own score when I view the result, </w:t>
+      </w:r>
+      <w:r>
+        <w:rPr>
+          <w:i/>
+          <w:iCs/>
+          <w:color w:val="666666"/>
+          <w:sz w:val="21"/>
+          <w:szCs w:val="21"/>
+        </w:rPr>
+        <w:t xml:space="preserve">so that I can see whether resubmitting actually improved my work, not just my latest grade.</w:t>
       </w:r>
     </w:p>
     <w:p>

</xml_diff>

<commit_message>
Cap quiz retakes at 3 attempts and show the attempt number in the retry popup
Mirrors the lab task's existing MAX_LAB_SUBMISSIONS=3 cap and its
attempt-numbered confirm dialog. The cap is enforced both where coins
are charged (getLessonQuiz's retake branch) and at the actual submit
endpoint, so a direct repeated POST can't bypass it or rack up free
attempts.

Co-Authored-By: Claude Sonnet 5 <noreply@anthropic.com>
</commit_message>
<xml_diff>
--- a/docs/jkthub-platform-prd-brd-user-stories.docx
+++ b/docs/jkthub-platform-prd-brd-user-stories.docx
@@ -4483,7 +4483,7 @@
         <w:spacing w:after="90"/>
       </w:pPr>
       <w:r>
-        <w:t xml:space="preserve">Retaking an already-submitted quiz costs 15 coins, confirmed via a pop-up before it proceeds; unlimited retakes, but only the first attempt ever earns XP or the boss-battle coin bonus.</w:t>
+        <w:t xml:space="preserve">Retaking an already-submitted quiz costs 15 coins, confirmed via a pop-up (which states the attempt number) before it proceeds; capped at 3 attempts total, same cap as a lesson-attached lab task, and only the first attempt ever earns XP or the boss-battle coin bonus.</w:t>
       </w:r>
     </w:p>
     <w:p>
@@ -9218,7 +9218,7 @@
           <w:sz w:val="21"/>
           <w:szCs w:val="21"/>
         </w:rPr>
-        <w:t xml:space="preserve">I want to retake a quiz as many times as I want, with a clear coin-cost warning before I commit, </w:t>
+        <w:t xml:space="preserve">I want to retake a quiz up to 3 times, with a clear coin-cost and attempt-number warning before each retry, </w:t>
       </w:r>
       <w:r>
         <w:rPr>
@@ -9228,7 +9228,7 @@
           <w:sz w:val="21"/>
           <w:szCs w:val="21"/>
         </w:rPr>
-        <w:t xml:space="preserve">so that I can keep practicing until I've really mastered it, even though only my first attempt earns XP, and I'm never surprised by a coin charge.</w:t>
+        <w:t xml:space="preserve">so that I can keep practicing within a fair limit, even though only my first attempt earns XP, and I always know exactly which attempt I'm paying for.</w:t>
       </w:r>
     </w:p>
     <w:p>

</xml_diff>

<commit_message>
Add a Pending Work section to the BRD: fix queue + Arcade overhaul initiative
Documents the known-issues register (§5) as now queued for active
resolution, and adds the newly-requested Arcade gamification/multiplayer
initiative as a tracked future item — difficulty levels, deeper
gamification, more games, and a classroom-activity multiplayer mode,
the last of which requires real-time infrastructure that doesn't exist
in the codebase yet.

Co-Authored-By: Claude Sonnet 5 <noreply@anthropic.com>
</commit_message>
<xml_diff>
--- a/docs/jkthub-platform-prd-brd-user-stories.docx
+++ b/docs/jkthub-platform-prd-brd-user-stories.docx
@@ -7539,6 +7539,458 @@
                 <w:szCs w:val="19"/>
               </w:rPr>
               <w:t xml:space="preserve">Should be enabled once the production domain is confirmed fully HTTPS end-to-end.</w:t>
+            </w:r>
+          </w:p>
+        </w:tc>
+      </w:tr>
+    </w:tbl>
+    <w:p>
+      <w:r>
+        <w:br w:type="page"/>
+      </w:r>
+    </w:p>
+    <w:p>
+      <w:pPr>
+        <w:pStyle w:val="Heading1"/>
+        <w:spacing w:after="160" w:before="320"/>
+      </w:pPr>
+      <w:r>
+        <w:t xml:space="preserve">6. Pending Work &amp; Near-Term Roadmap</w:t>
+      </w:r>
+    </w:p>
+    <w:p>
+      <w:pPr>
+        <w:spacing w:after="160" w:line="300"/>
+      </w:pPr>
+      <w:r>
+        <w:rPr>
+          <w:sz w:val="21"/>
+          <w:szCs w:val="21"/>
+        </w:rPr>
+        <w:t xml:space="preserve">All items in the Known Issues &amp; Technical Debt Register (§5) are now queued for resolution and are being worked through incrementally, starting with the highest-impact security/trust-boundary gaps (parent result-page ownership checks, badge-awarding trust boundary, inconsistent student-route auth gating) before cosmetic/dead-code items.</w:t>
+      </w:r>
+    </w:p>
+    <w:p>
+      <w:pPr>
+        <w:spacing w:after="160"/>
+      </w:pPr>
+    </w:p>
+    <w:p>
+      <w:pPr>
+        <w:pStyle w:val="Heading3"/>
+        <w:spacing w:after="160" w:before="320"/>
+      </w:pPr>
+      <w:r>
+        <w:t xml:space="preserve">New Initiative: Arcade Gamification &amp; Multiplayer</w:t>
+      </w:r>
+    </w:p>
+    <w:p>
+      <w:pPr>
+        <w:spacing w:after="160" w:line="300"/>
+      </w:pPr>
+      <w:r>
+        <w:rPr>
+          <w:sz w:val="21"/>
+          <w:szCs w:val="21"/>
+        </w:rPr>
+        <w:t xml:space="preserve">Requested next: turn the Arcade from a set of static solo mini-games into a more gamified, more varied, and optionally multiplayer experience usable as a live classroom activity. Below is the shape of the ask as of this revision — design and sequencing to be finalized before implementation.</w:t>
+      </w:r>
+    </w:p>
+    <w:tbl>
+      <w:tblPr>
+        <w:tblW w:type="dxa" w:w="9350"/>
+        <w:tblBorders>
+          <w:top w:val="single" w:color="auto" w:sz="4"/>
+          <w:left w:val="single" w:color="auto" w:sz="4"/>
+          <w:bottom w:val="single" w:color="auto" w:sz="4"/>
+          <w:right w:val="single" w:color="auto" w:sz="4"/>
+          <w:insideH w:val="single" w:color="auto" w:sz="4"/>
+          <w:insideV w:val="single" w:color="auto" w:sz="4"/>
+        </w:tblBorders>
+      </w:tblPr>
+      <w:tblGrid>
+        <w:gridCol w:w="1800"/>
+        <w:gridCol w:w="2200"/>
+        <w:gridCol w:w="5350"/>
+      </w:tblGrid>
+      <w:tr>
+        <w:trPr>
+          <w:tblHeader/>
+        </w:trPr>
+        <w:tc>
+          <w:tcPr>
+            <w:tcW w:type="dxa" w:w="1800"/>
+            <w:shd w:fill="A17807" w:color="auto" w:val="clear"/>
+            <w:tcMar>
+              <w:top w:type="dxa" w:w="80"/>
+              <w:left w:type="dxa" w:w="100"/>
+              <w:bottom w:type="dxa" w:w="80"/>
+              <w:right w:type="dxa" w:w="100"/>
+            </w:tcMar>
+            <w:vAlign w:val="center"/>
+          </w:tcPr>
+          <w:p>
+            <w:r>
+              <w:rPr>
+                <w:b/>
+                <w:bCs/>
+                <w:color w:val="FFFFFF"/>
+                <w:sz w:val="19"/>
+                <w:szCs w:val="19"/>
+              </w:rPr>
+              <w:t xml:space="preserve">Area</w:t>
+            </w:r>
+          </w:p>
+        </w:tc>
+        <w:tc>
+          <w:tcPr>
+            <w:tcW w:type="dxa" w:w="2200"/>
+            <w:shd w:fill="A17807" w:color="auto" w:val="clear"/>
+            <w:tcMar>
+              <w:top w:type="dxa" w:w="80"/>
+              <w:left w:type="dxa" w:w="100"/>
+              <w:bottom w:type="dxa" w:w="80"/>
+              <w:right w:type="dxa" w:w="100"/>
+            </w:tcMar>
+            <w:vAlign w:val="center"/>
+          </w:tcPr>
+          <w:p>
+            <w:r>
+              <w:rPr>
+                <w:b/>
+                <w:bCs/>
+                <w:color w:val="FFFFFF"/>
+                <w:sz w:val="19"/>
+                <w:szCs w:val="19"/>
+              </w:rPr>
+              <w:t xml:space="preserve">Item</w:t>
+            </w:r>
+          </w:p>
+        </w:tc>
+        <w:tc>
+          <w:tcPr>
+            <w:tcW w:type="dxa" w:w="5350"/>
+            <w:shd w:fill="A17807" w:color="auto" w:val="clear"/>
+            <w:tcMar>
+              <w:top w:type="dxa" w:w="80"/>
+              <w:left w:type="dxa" w:w="100"/>
+              <w:bottom w:type="dxa" w:w="80"/>
+              <w:right w:type="dxa" w:w="100"/>
+            </w:tcMar>
+            <w:vAlign w:val="center"/>
+          </w:tcPr>
+          <w:p>
+            <w:r>
+              <w:rPr>
+                <w:b/>
+                <w:bCs/>
+                <w:color w:val="FFFFFF"/>
+                <w:sz w:val="19"/>
+                <w:szCs w:val="19"/>
+              </w:rPr>
+              <w:t xml:space="preserve">Notes</w:t>
+            </w:r>
+          </w:p>
+        </w:tc>
+      </w:tr>
+      <w:tr>
+        <w:tc>
+          <w:tcPr>
+            <w:tcW w:type="dxa" w:w="1800"/>
+            <w:tcMar>
+              <w:top w:type="dxa" w:w="80"/>
+              <w:left w:type="dxa" w:w="100"/>
+              <w:bottom w:type="dxa" w:w="80"/>
+              <w:right w:type="dxa" w:w="100"/>
+            </w:tcMar>
+            <w:vAlign w:val="center"/>
+          </w:tcPr>
+          <w:p>
+            <w:r>
+              <w:rPr>
+                <w:b w:val="false"/>
+                <w:bCs w:val="false"/>
+                <w:color w:val="2B2B2B"/>
+                <w:sz w:val="19"/>
+                <w:szCs w:val="19"/>
+              </w:rPr>
+              <w:t xml:space="preserve">Student — Arcade</w:t>
+            </w:r>
+          </w:p>
+        </w:tc>
+        <w:tc>
+          <w:tcPr>
+            <w:tcW w:type="dxa" w:w="2200"/>
+            <w:tcMar>
+              <w:top w:type="dxa" w:w="80"/>
+              <w:left w:type="dxa" w:w="100"/>
+              <w:bottom w:type="dxa" w:w="80"/>
+              <w:right w:type="dxa" w:w="100"/>
+            </w:tcMar>
+            <w:vAlign w:val="center"/>
+          </w:tcPr>
+          <w:p>
+            <w:r>
+              <w:rPr>
+                <w:b w:val="false"/>
+                <w:bCs w:val="false"/>
+                <w:color w:val="2B2B2B"/>
+                <w:sz w:val="19"/>
+                <w:szCs w:val="19"/>
+              </w:rPr>
+              <w:t xml:space="preserve">Difficulty levels</w:t>
+            </w:r>
+          </w:p>
+        </w:tc>
+        <w:tc>
+          <w:tcPr>
+            <w:tcW w:type="dxa" w:w="5350"/>
+            <w:tcMar>
+              <w:top w:type="dxa" w:w="80"/>
+              <w:left w:type="dxa" w:w="100"/>
+              <w:bottom w:type="dxa" w:w="80"/>
+              <w:right w:type="dxa" w:w="100"/>
+            </w:tcMar>
+            <w:vAlign w:val="center"/>
+          </w:tcPr>
+          <w:p>
+            <w:r>
+              <w:rPr>
+                <w:b w:val="false"/>
+                <w:bCs w:val="false"/>
+                <w:color w:val="2B2B2B"/>
+                <w:sz w:val="19"/>
+                <w:szCs w:val="19"/>
+              </w:rPr>
+              <w:t xml:space="preserve">Each arcade game gains selectable difficulty tiers (e.g. Easy/Medium/Hard) affecting question pool, time pressure, and/or scoring — currently games have no difficulty concept.</w:t>
+            </w:r>
+          </w:p>
+        </w:tc>
+      </w:tr>
+      <w:tr>
+        <w:tc>
+          <w:tcPr>
+            <w:tcW w:type="dxa" w:w="1800"/>
+            <w:shd w:fill="F4F1EA" w:color="auto" w:val="clear"/>
+            <w:tcMar>
+              <w:top w:type="dxa" w:w="80"/>
+              <w:left w:type="dxa" w:w="100"/>
+              <w:bottom w:type="dxa" w:w="80"/>
+              <w:right w:type="dxa" w:w="100"/>
+            </w:tcMar>
+            <w:vAlign w:val="center"/>
+          </w:tcPr>
+          <w:p>
+            <w:r>
+              <w:rPr>
+                <w:b w:val="false"/>
+                <w:bCs w:val="false"/>
+                <w:color w:val="2B2B2B"/>
+                <w:sz w:val="19"/>
+                <w:szCs w:val="19"/>
+              </w:rPr>
+              <w:t xml:space="preserve">Student — Arcade</w:t>
+            </w:r>
+          </w:p>
+        </w:tc>
+        <w:tc>
+          <w:tcPr>
+            <w:tcW w:type="dxa" w:w="2200"/>
+            <w:shd w:fill="F4F1EA" w:color="auto" w:val="clear"/>
+            <w:tcMar>
+              <w:top w:type="dxa" w:w="80"/>
+              <w:left w:type="dxa" w:w="100"/>
+              <w:bottom w:type="dxa" w:w="80"/>
+              <w:right w:type="dxa" w:w="100"/>
+            </w:tcMar>
+            <w:vAlign w:val="center"/>
+          </w:tcPr>
+          <w:p>
+            <w:r>
+              <w:rPr>
+                <w:b w:val="false"/>
+                <w:bCs w:val="false"/>
+                <w:color w:val="2B2B2B"/>
+                <w:sz w:val="19"/>
+                <w:szCs w:val="19"/>
+              </w:rPr>
+              <w:t xml:space="preserve">Deeper gamification</w:t>
+            </w:r>
+          </w:p>
+        </w:tc>
+        <w:tc>
+          <w:tcPr>
+            <w:tcW w:type="dxa" w:w="5350"/>
+            <w:shd w:fill="F4F1EA" w:color="auto" w:val="clear"/>
+            <w:tcMar>
+              <w:top w:type="dxa" w:w="80"/>
+              <w:left w:type="dxa" w:w="100"/>
+              <w:bottom w:type="dxa" w:w="80"/>
+              <w:right w:type="dxa" w:w="100"/>
+            </w:tcMar>
+            <w:vAlign w:val="center"/>
+          </w:tcPr>
+          <w:p>
+            <w:r>
+              <w:rPr>
+                <w:b w:val="false"/>
+                <w:bCs w:val="false"/>
+                <w:color w:val="2B2B2B"/>
+                <w:sz w:val="19"/>
+                <w:szCs w:val="19"/>
+              </w:rPr>
+              <w:t xml:space="preserve">Streak bonuses, per-game leaderboards, unlockable cosmetics/badges tied to arcade performance specifically (distinct from the existing quiz/lesson XP system) — scope to be finalized.</w:t>
+            </w:r>
+          </w:p>
+        </w:tc>
+      </w:tr>
+      <w:tr>
+        <w:tc>
+          <w:tcPr>
+            <w:tcW w:type="dxa" w:w="1800"/>
+            <w:tcMar>
+              <w:top w:type="dxa" w:w="80"/>
+              <w:left w:type="dxa" w:w="100"/>
+              <w:bottom w:type="dxa" w:w="80"/>
+              <w:right w:type="dxa" w:w="100"/>
+            </w:tcMar>
+            <w:vAlign w:val="center"/>
+          </w:tcPr>
+          <w:p>
+            <w:r>
+              <w:rPr>
+                <w:b w:val="false"/>
+                <w:bCs w:val="false"/>
+                <w:color w:val="2B2B2B"/>
+                <w:sz w:val="19"/>
+                <w:szCs w:val="19"/>
+              </w:rPr>
+              <w:t xml:space="preserve">Student — Arcade</w:t>
+            </w:r>
+          </w:p>
+        </w:tc>
+        <w:tc>
+          <w:tcPr>
+            <w:tcW w:type="dxa" w:w="2200"/>
+            <w:tcMar>
+              <w:top w:type="dxa" w:w="80"/>
+              <w:left w:type="dxa" w:w="100"/>
+              <w:bottom w:type="dxa" w:w="80"/>
+              <w:right w:type="dxa" w:w="100"/>
+            </w:tcMar>
+            <w:vAlign w:val="center"/>
+          </w:tcPr>
+          <w:p>
+            <w:r>
+              <w:rPr>
+                <w:b w:val="false"/>
+                <w:bCs w:val="false"/>
+                <w:color w:val="2B2B2B"/>
+                <w:sz w:val="19"/>
+                <w:szCs w:val="19"/>
+              </w:rPr>
+              <w:t xml:space="preserve">More educational games</w:t>
+            </w:r>
+          </w:p>
+        </w:tc>
+        <w:tc>
+          <w:tcPr>
+            <w:tcW w:type="dxa" w:w="5350"/>
+            <w:tcMar>
+              <w:top w:type="dxa" w:w="80"/>
+              <w:left w:type="dxa" w:w="100"/>
+              <w:bottom w:type="dxa" w:w="80"/>
+              <w:right w:type="dxa" w:w="100"/>
+            </w:tcMar>
+            <w:vAlign w:val="center"/>
+          </w:tcPr>
+          <w:p>
+            <w:r>
+              <w:rPr>
+                <w:b w:val="false"/>
+                <w:bCs w:val="false"/>
+                <w:color w:val="2B2B2B"/>
+                <w:sz w:val="19"/>
+                <w:szCs w:val="19"/>
+              </w:rPr>
+              <w:t xml:space="preserve">Expand beyond the current game roster with additional subject-aligned mini-games.</w:t>
+            </w:r>
+          </w:p>
+        </w:tc>
+      </w:tr>
+      <w:tr>
+        <w:tc>
+          <w:tcPr>
+            <w:tcW w:type="dxa" w:w="1800"/>
+            <w:shd w:fill="F4F1EA" w:color="auto" w:val="clear"/>
+            <w:tcMar>
+              <w:top w:type="dxa" w:w="80"/>
+              <w:left w:type="dxa" w:w="100"/>
+              <w:bottom w:type="dxa" w:w="80"/>
+              <w:right w:type="dxa" w:w="100"/>
+            </w:tcMar>
+            <w:vAlign w:val="center"/>
+          </w:tcPr>
+          <w:p>
+            <w:r>
+              <w:rPr>
+                <w:b w:val="false"/>
+                <w:bCs w:val="false"/>
+                <w:color w:val="2B2B2B"/>
+                <w:sz w:val="19"/>
+                <w:szCs w:val="19"/>
+              </w:rPr>
+              <w:t xml:space="preserve">Student — Arcade</w:t>
+            </w:r>
+          </w:p>
+        </w:tc>
+        <w:tc>
+          <w:tcPr>
+            <w:tcW w:type="dxa" w:w="2200"/>
+            <w:shd w:fill="F4F1EA" w:color="auto" w:val="clear"/>
+            <w:tcMar>
+              <w:top w:type="dxa" w:w="80"/>
+              <w:left w:type="dxa" w:w="100"/>
+              <w:bottom w:type="dxa" w:w="80"/>
+              <w:right w:type="dxa" w:w="100"/>
+            </w:tcMar>
+            <w:vAlign w:val="center"/>
+          </w:tcPr>
+          <w:p>
+            <w:r>
+              <w:rPr>
+                <w:b w:val="false"/>
+                <w:bCs w:val="false"/>
+                <w:color w:val="2B2B2B"/>
+                <w:sz w:val="19"/>
+                <w:szCs w:val="19"/>
+              </w:rPr>
+              <w:t xml:space="preserve">Multiplayer / classroom-activity mode</w:t>
+            </w:r>
+          </w:p>
+        </w:tc>
+        <w:tc>
+          <w:tcPr>
+            <w:tcW w:type="dxa" w:w="5350"/>
+            <w:shd w:fill="F4F1EA" w:color="auto" w:val="clear"/>
+            <w:tcMar>
+              <w:top w:type="dxa" w:w="80"/>
+              <w:left w:type="dxa" w:w="100"/>
+              <w:bottom w:type="dxa" w:w="80"/>
+              <w:right w:type="dxa" w:w="100"/>
+            </w:tcMar>
+            <w:vAlign w:val="center"/>
+          </w:tcPr>
+          <w:p>
+            <w:r>
+              <w:rPr>
+                <w:b w:val="false"/>
+                <w:bCs w:val="false"/>
+                <w:color w:val="2B2B2B"/>
+                <w:sz w:val="19"/>
+                <w:szCs w:val="19"/>
+              </w:rPr>
+              <w:t xml:space="preserve">Real-time, synchronous play so a teacher can run an arcade game live as a class activity (Kahoot-style) — the single biggest lift of this initiative, since no real-time/WebSocket infrastructure exists anywhere in the codebase today. Requires new server-side real-time plumbing, a classroom-session/room concept, and live-scoring UI, none of which currently exist.</w:t>
             </w:r>
           </w:p>
         </w:tc>

</xml_diff>

<commit_message>
Remove two dead, client-trusting/broken student routes
POST /student/award-badge let the browser tell the server which badge
to award for which module, with zero verification the student actually
earned it — a real trust-boundary hole, and confirmed unused by any
current view (the legitimate, properly-verified badge award path
already exists in services/moduleCompletionService.js, triggered on
real module completion). GET /student/analytics rendered the full
student dashboard template with only a `chart` local, missing every
other variable that template unconditionally references — confirmed
dead (no view links to it) and would 500 if ever hit; "My Progress"
already covers this analytics need properly.

Verified live: both routes now correctly inaccessible, and the real
dashboard still renders fine for an authenticated session.

Co-Authored-By: Claude Sonnet 5 <noreply@anthropic.com>
</commit_message>
<xml_diff>
--- a/docs/jkthub-platform-prd-brd-user-stories.docx
+++ b/docs/jkthub-platform-prd-brd-user-stories.docx
@@ -6986,7 +6986,7 @@
                 <w:sz w:val="19"/>
                 <w:szCs w:val="19"/>
               </w:rPr>
-              <w:t xml:space="preserve">/student/analytics</w:t>
+              <w:t xml:space="preserve">Inconsistent auth gating</w:t>
             </w:r>
           </w:p>
         </w:tc>
@@ -7011,7 +7011,7 @@
                 <w:sz w:val="19"/>
                 <w:szCs w:val="19"/>
               </w:rPr>
-              <w:t xml:space="preserve">Loads the dashboard template without the data it expects — a dead route left over from an earlier iteration.</w:t>
+              <w:t xml:space="preserve">Several /student routes don't require ensureAuthenticated even though the router has no blanket auth gate of its own — a pre-existing inconsistency, not something introduced recently.</w:t>
             </w:r>
           </w:p>
         </w:tc>
@@ -7037,7 +7037,7 @@
                 <w:sz w:val="19"/>
                 <w:szCs w:val="19"/>
               </w:rPr>
-              <w:t xml:space="preserve">Student</w:t>
+              <w:t xml:space="preserve">Parent</w:t>
             </w:r>
           </w:p>
         </w:tc>
@@ -7061,7 +7061,7 @@
                 <w:sz w:val="19"/>
                 <w:szCs w:val="19"/>
               </w:rPr>
-              <w:t xml:space="preserve">Badge awarding is client-triggered</w:t>
+              <w:t xml:space="preserve">No parent-teacher messaging surface</w:t>
             </w:r>
           </w:p>
         </w:tc>
@@ -7085,7 +7085,7 @@
                 <w:sz w:val="19"/>
                 <w:szCs w:val="19"/>
               </w:rPr>
-              <w:t xml:space="preserve">The browser calls /student/award-badge to tell the server to award a badge, rather than the server deciding independently — a trust-boundary weakness worth revisiting.</w:t>
+              <w:t xml:space="preserve">A general direct-message API exists platform-wide, but nothing on the parent dashboard exposes it for contacting a teacher.</w:t>
             </w:r>
           </w:p>
         </w:tc>
@@ -7112,7 +7112,7 @@
                 <w:sz w:val="19"/>
                 <w:szCs w:val="19"/>
               </w:rPr>
-              <w:t xml:space="preserve">Student</w:t>
+              <w:t xml:space="preserve">Public</w:t>
             </w:r>
           </w:p>
         </w:tc>
@@ -7137,7 +7137,7 @@
                 <w:sz w:val="19"/>
                 <w:szCs w:val="19"/>
               </w:rPr>
-              <w:t xml:space="preserve">Inconsistent auth gating</w:t>
+              <w:t xml:space="preserve">Footer newsletter sign-up is wired to the wrong endpoint</w:t>
             </w:r>
           </w:p>
         </w:tc>
@@ -7162,7 +7162,7 @@
                 <w:sz w:val="19"/>
                 <w:szCs w:val="19"/>
               </w:rPr>
-              <w:t xml:space="preserve">Several /student routes don't require ensureAuthenticated even though the router has no blanket auth gate of its own — a pre-existing inconsistency, not something introduced recently.</w:t>
+              <w:t xml:space="preserve">It posts to /subscribe, which is actually the browser-push opt-in — there is no real email-list sign-up handler behind it.</w:t>
             </w:r>
           </w:p>
         </w:tc>
@@ -7188,7 +7188,7 @@
                 <w:sz w:val="19"/>
                 <w:szCs w:val="19"/>
               </w:rPr>
-              <w:t xml:space="preserve">Parent</w:t>
+              <w:t xml:space="preserve">Cross-cutting</w:t>
             </w:r>
           </w:p>
         </w:tc>
@@ -7212,7 +7212,7 @@
                 <w:sz w:val="19"/>
                 <w:szCs w:val="19"/>
               </w:rPr>
-              <w:t xml:space="preserve">Quiz/assignment result pages have no ownership check</w:t>
+              <w:t xml:space="preserve">CSRF coverage is partial</w:t>
             </w:r>
           </w:p>
         </w:tc>
@@ -7236,7 +7236,7 @@
                 <w:sz w:val="19"/>
                 <w:szCs w:val="19"/>
               </w:rPr>
-              <w:t xml:space="preserve">Anyone with the link can open a result page — should be scoped to the owning parent/student.</w:t>
+              <w:t xml:space="preserve">Being added router-by-router (per the project's own established pattern); some older routes remain unprotected.</w:t>
             </w:r>
           </w:p>
         </w:tc>
@@ -7263,7 +7263,7 @@
                 <w:sz w:val="19"/>
                 <w:szCs w:val="19"/>
               </w:rPr>
-              <w:t xml:space="preserve">Parent</w:t>
+              <w:t xml:space="preserve">Cross-cutting</w:t>
             </w:r>
           </w:p>
         </w:tc>
@@ -7288,7 +7288,7 @@
                 <w:sz w:val="19"/>
                 <w:szCs w:val="19"/>
               </w:rPr>
-              <w:t xml:space="preserve">No parent-teacher messaging surface</w:t>
+              <w:t xml:space="preserve">Session cookie `secure` flag is false</w:t>
             </w:r>
           </w:p>
         </w:tc>
@@ -7296,231 +7296,6 @@
           <w:tcPr>
             <w:tcW w:type="dxa" w:w="4350"/>
             <w:shd w:fill="F4F1EA" w:color="auto" w:val="clear"/>
-            <w:tcMar>
-              <w:top w:type="dxa" w:w="80"/>
-              <w:left w:type="dxa" w:w="100"/>
-              <w:bottom w:type="dxa" w:w="80"/>
-              <w:right w:type="dxa" w:w="100"/>
-            </w:tcMar>
-            <w:vAlign w:val="center"/>
-          </w:tcPr>
-          <w:p>
-            <w:r>
-              <w:rPr>
-                <w:b w:val="false"/>
-                <w:bCs w:val="false"/>
-                <w:color w:val="2B2B2B"/>
-                <w:sz w:val="19"/>
-                <w:szCs w:val="19"/>
-              </w:rPr>
-              <w:t xml:space="preserve">A general direct-message API exists platform-wide, but nothing on the parent dashboard exposes it for contacting a teacher.</w:t>
-            </w:r>
-          </w:p>
-        </w:tc>
-      </w:tr>
-      <w:tr>
-        <w:tc>
-          <w:tcPr>
-            <w:tcW w:type="dxa" w:w="1400"/>
-            <w:tcMar>
-              <w:top w:type="dxa" w:w="80"/>
-              <w:left w:type="dxa" w:w="100"/>
-              <w:bottom w:type="dxa" w:w="80"/>
-              <w:right w:type="dxa" w:w="100"/>
-            </w:tcMar>
-            <w:vAlign w:val="center"/>
-          </w:tcPr>
-          <w:p>
-            <w:r>
-              <w:rPr>
-                <w:b w:val="false"/>
-                <w:bCs w:val="false"/>
-                <w:color w:val="2B2B2B"/>
-                <w:sz w:val="19"/>
-                <w:szCs w:val="19"/>
-              </w:rPr>
-              <w:t xml:space="preserve">Public</w:t>
-            </w:r>
-          </w:p>
-        </w:tc>
-        <w:tc>
-          <w:tcPr>
-            <w:tcW w:type="dxa" w:w="3600"/>
-            <w:tcMar>
-              <w:top w:type="dxa" w:w="80"/>
-              <w:left w:type="dxa" w:w="100"/>
-              <w:bottom w:type="dxa" w:w="80"/>
-              <w:right w:type="dxa" w:w="100"/>
-            </w:tcMar>
-            <w:vAlign w:val="center"/>
-          </w:tcPr>
-          <w:p>
-            <w:r>
-              <w:rPr>
-                <w:b w:val="false"/>
-                <w:bCs w:val="false"/>
-                <w:color w:val="2B2B2B"/>
-                <w:sz w:val="19"/>
-                <w:szCs w:val="19"/>
-              </w:rPr>
-              <w:t xml:space="preserve">Footer newsletter sign-up is wired to the wrong endpoint</w:t>
-            </w:r>
-          </w:p>
-        </w:tc>
-        <w:tc>
-          <w:tcPr>
-            <w:tcW w:type="dxa" w:w="4350"/>
-            <w:tcMar>
-              <w:top w:type="dxa" w:w="80"/>
-              <w:left w:type="dxa" w:w="100"/>
-              <w:bottom w:type="dxa" w:w="80"/>
-              <w:right w:type="dxa" w:w="100"/>
-            </w:tcMar>
-            <w:vAlign w:val="center"/>
-          </w:tcPr>
-          <w:p>
-            <w:r>
-              <w:rPr>
-                <w:b w:val="false"/>
-                <w:bCs w:val="false"/>
-                <w:color w:val="2B2B2B"/>
-                <w:sz w:val="19"/>
-                <w:szCs w:val="19"/>
-              </w:rPr>
-              <w:t xml:space="preserve">It posts to /subscribe, which is actually the browser-push opt-in — there is no real email-list sign-up handler behind it.</w:t>
-            </w:r>
-          </w:p>
-        </w:tc>
-      </w:tr>
-      <w:tr>
-        <w:tc>
-          <w:tcPr>
-            <w:tcW w:type="dxa" w:w="1400"/>
-            <w:shd w:fill="F4F1EA" w:color="auto" w:val="clear"/>
-            <w:tcMar>
-              <w:top w:type="dxa" w:w="80"/>
-              <w:left w:type="dxa" w:w="100"/>
-              <w:bottom w:type="dxa" w:w="80"/>
-              <w:right w:type="dxa" w:w="100"/>
-            </w:tcMar>
-            <w:vAlign w:val="center"/>
-          </w:tcPr>
-          <w:p>
-            <w:r>
-              <w:rPr>
-                <w:b w:val="false"/>
-                <w:bCs w:val="false"/>
-                <w:color w:val="2B2B2B"/>
-                <w:sz w:val="19"/>
-                <w:szCs w:val="19"/>
-              </w:rPr>
-              <w:t xml:space="preserve">Cross-cutting</w:t>
-            </w:r>
-          </w:p>
-        </w:tc>
-        <w:tc>
-          <w:tcPr>
-            <w:tcW w:type="dxa" w:w="3600"/>
-            <w:shd w:fill="F4F1EA" w:color="auto" w:val="clear"/>
-            <w:tcMar>
-              <w:top w:type="dxa" w:w="80"/>
-              <w:left w:type="dxa" w:w="100"/>
-              <w:bottom w:type="dxa" w:w="80"/>
-              <w:right w:type="dxa" w:w="100"/>
-            </w:tcMar>
-            <w:vAlign w:val="center"/>
-          </w:tcPr>
-          <w:p>
-            <w:r>
-              <w:rPr>
-                <w:b w:val="false"/>
-                <w:bCs w:val="false"/>
-                <w:color w:val="2B2B2B"/>
-                <w:sz w:val="19"/>
-                <w:szCs w:val="19"/>
-              </w:rPr>
-              <w:t xml:space="preserve">CSRF coverage is partial</w:t>
-            </w:r>
-          </w:p>
-        </w:tc>
-        <w:tc>
-          <w:tcPr>
-            <w:tcW w:type="dxa" w:w="4350"/>
-            <w:shd w:fill="F4F1EA" w:color="auto" w:val="clear"/>
-            <w:tcMar>
-              <w:top w:type="dxa" w:w="80"/>
-              <w:left w:type="dxa" w:w="100"/>
-              <w:bottom w:type="dxa" w:w="80"/>
-              <w:right w:type="dxa" w:w="100"/>
-            </w:tcMar>
-            <w:vAlign w:val="center"/>
-          </w:tcPr>
-          <w:p>
-            <w:r>
-              <w:rPr>
-                <w:b w:val="false"/>
-                <w:bCs w:val="false"/>
-                <w:color w:val="2B2B2B"/>
-                <w:sz w:val="19"/>
-                <w:szCs w:val="19"/>
-              </w:rPr>
-              <w:t xml:space="preserve">Being added router-by-router (per the project's own established pattern); some older routes remain unprotected.</w:t>
-            </w:r>
-          </w:p>
-        </w:tc>
-      </w:tr>
-      <w:tr>
-        <w:tc>
-          <w:tcPr>
-            <w:tcW w:type="dxa" w:w="1400"/>
-            <w:tcMar>
-              <w:top w:type="dxa" w:w="80"/>
-              <w:left w:type="dxa" w:w="100"/>
-              <w:bottom w:type="dxa" w:w="80"/>
-              <w:right w:type="dxa" w:w="100"/>
-            </w:tcMar>
-            <w:vAlign w:val="center"/>
-          </w:tcPr>
-          <w:p>
-            <w:r>
-              <w:rPr>
-                <w:b w:val="false"/>
-                <w:bCs w:val="false"/>
-                <w:color w:val="2B2B2B"/>
-                <w:sz w:val="19"/>
-                <w:szCs w:val="19"/>
-              </w:rPr>
-              <w:t xml:space="preserve">Cross-cutting</w:t>
-            </w:r>
-          </w:p>
-        </w:tc>
-        <w:tc>
-          <w:tcPr>
-            <w:tcW w:type="dxa" w:w="3600"/>
-            <w:tcMar>
-              <w:top w:type="dxa" w:w="80"/>
-              <w:left w:type="dxa" w:w="100"/>
-              <w:bottom w:type="dxa" w:w="80"/>
-              <w:right w:type="dxa" w:w="100"/>
-            </w:tcMar>
-            <w:vAlign w:val="center"/>
-          </w:tcPr>
-          <w:p>
-            <w:r>
-              <w:rPr>
-                <w:b w:val="false"/>
-                <w:bCs w:val="false"/>
-                <w:color w:val="2B2B2B"/>
-                <w:sz w:val="19"/>
-                <w:szCs w:val="19"/>
-              </w:rPr>
-              <w:t xml:space="preserve">Session cookie `secure` flag is false</w:t>
-            </w:r>
-          </w:p>
-        </w:tc>
-        <w:tc>
-          <w:tcPr>
-            <w:tcW w:type="dxa" w:w="4350"/>
             <w:tcMar>
               <w:top w:type="dxa" w:w="80"/>
               <w:left w:type="dxa" w:w="100"/>

</xml_diff>

<commit_message>
Regenerate BRD docx (was skipped in de4051f while the file was open in Word)
Co-Authored-By: Claude Sonnet 5 <noreply@anthropic.com>
</commit_message>
<xml_diff>
--- a/docs/jkthub-platform-prd-brd-user-stories.docx
+++ b/docs/jkthub-platform-prd-brd-user-stories.docx
@@ -6961,7 +6961,7 @@
                 <w:sz w:val="19"/>
                 <w:szCs w:val="19"/>
               </w:rPr>
-              <w:t xml:space="preserve">Student</w:t>
+              <w:t xml:space="preserve">Parent</w:t>
             </w:r>
           </w:p>
         </w:tc>
@@ -6986,7 +6986,7 @@
                 <w:sz w:val="19"/>
                 <w:szCs w:val="19"/>
               </w:rPr>
-              <w:t xml:space="preserve">Inconsistent auth gating</w:t>
+              <w:t xml:space="preserve">No parent-teacher messaging surface</w:t>
             </w:r>
           </w:p>
         </w:tc>
@@ -7011,7 +7011,7 @@
                 <w:sz w:val="19"/>
                 <w:szCs w:val="19"/>
               </w:rPr>
-              <w:t xml:space="preserve">Several /student routes don't require ensureAuthenticated even though the router has no blanket auth gate of its own — a pre-existing inconsistency, not something introduced recently.</w:t>
+              <w:t xml:space="preserve">A general direct-message API exists platform-wide, but nothing on the parent dashboard exposes it for contacting a teacher.</w:t>
             </w:r>
           </w:p>
         </w:tc>
@@ -7037,7 +7037,7 @@
                 <w:sz w:val="19"/>
                 <w:szCs w:val="19"/>
               </w:rPr>
-              <w:t xml:space="preserve">Parent</w:t>
+              <w:t xml:space="preserve">Public</w:t>
             </w:r>
           </w:p>
         </w:tc>
@@ -7061,7 +7061,7 @@
                 <w:sz w:val="19"/>
                 <w:szCs w:val="19"/>
               </w:rPr>
-              <w:t xml:space="preserve">No parent-teacher messaging surface</w:t>
+              <w:t xml:space="preserve">Footer newsletter sign-up is wired to the wrong endpoint</w:t>
             </w:r>
           </w:p>
         </w:tc>
@@ -7085,7 +7085,7 @@
                 <w:sz w:val="19"/>
                 <w:szCs w:val="19"/>
               </w:rPr>
-              <w:t xml:space="preserve">A general direct-message API exists platform-wide, but nothing on the parent dashboard exposes it for contacting a teacher.</w:t>
+              <w:t xml:space="preserve">It posts to /subscribe, which is actually the browser-push opt-in — there is no real email-list sign-up handler behind it.</w:t>
             </w:r>
           </w:p>
         </w:tc>
@@ -7112,7 +7112,7 @@
                 <w:sz w:val="19"/>
                 <w:szCs w:val="19"/>
               </w:rPr>
-              <w:t xml:space="preserve">Public</w:t>
+              <w:t xml:space="preserve">Cross-cutting</w:t>
             </w:r>
           </w:p>
         </w:tc>
@@ -7137,7 +7137,7 @@
                 <w:sz w:val="19"/>
                 <w:szCs w:val="19"/>
               </w:rPr>
-              <w:t xml:space="preserve">Footer newsletter sign-up is wired to the wrong endpoint</w:t>
+              <w:t xml:space="preserve">CSRF coverage is partial</w:t>
             </w:r>
           </w:p>
         </w:tc>
@@ -7162,7 +7162,7 @@
                 <w:sz w:val="19"/>
                 <w:szCs w:val="19"/>
               </w:rPr>
-              <w:t xml:space="preserve">It posts to /subscribe, which is actually the browser-push opt-in — there is no real email-list sign-up handler behind it.</w:t>
+              <w:t xml:space="preserve">Being added router-by-router (per the project's own established pattern); some older routes remain unprotected.</w:t>
             </w:r>
           </w:p>
         </w:tc>
@@ -7212,90 +7212,13 @@
                 <w:sz w:val="19"/>
                 <w:szCs w:val="19"/>
               </w:rPr>
-              <w:t xml:space="preserve">CSRF coverage is partial</w:t>
+              <w:t xml:space="preserve">Session cookie `secure` flag is false</w:t>
             </w:r>
           </w:p>
         </w:tc>
         <w:tc>
           <w:tcPr>
             <w:tcW w:type="dxa" w:w="4350"/>
-            <w:tcMar>
-              <w:top w:type="dxa" w:w="80"/>
-              <w:left w:type="dxa" w:w="100"/>
-              <w:bottom w:type="dxa" w:w="80"/>
-              <w:right w:type="dxa" w:w="100"/>
-            </w:tcMar>
-            <w:vAlign w:val="center"/>
-          </w:tcPr>
-          <w:p>
-            <w:r>
-              <w:rPr>
-                <w:b w:val="false"/>
-                <w:bCs w:val="false"/>
-                <w:color w:val="2B2B2B"/>
-                <w:sz w:val="19"/>
-                <w:szCs w:val="19"/>
-              </w:rPr>
-              <w:t xml:space="preserve">Being added router-by-router (per the project's own established pattern); some older routes remain unprotected.</w:t>
-            </w:r>
-          </w:p>
-        </w:tc>
-      </w:tr>
-      <w:tr>
-        <w:tc>
-          <w:tcPr>
-            <w:tcW w:type="dxa" w:w="1400"/>
-            <w:shd w:fill="F4F1EA" w:color="auto" w:val="clear"/>
-            <w:tcMar>
-              <w:top w:type="dxa" w:w="80"/>
-              <w:left w:type="dxa" w:w="100"/>
-              <w:bottom w:type="dxa" w:w="80"/>
-              <w:right w:type="dxa" w:w="100"/>
-            </w:tcMar>
-            <w:vAlign w:val="center"/>
-          </w:tcPr>
-          <w:p>
-            <w:r>
-              <w:rPr>
-                <w:b w:val="false"/>
-                <w:bCs w:val="false"/>
-                <w:color w:val="2B2B2B"/>
-                <w:sz w:val="19"/>
-                <w:szCs w:val="19"/>
-              </w:rPr>
-              <w:t xml:space="preserve">Cross-cutting</w:t>
-            </w:r>
-          </w:p>
-        </w:tc>
-        <w:tc>
-          <w:tcPr>
-            <w:tcW w:type="dxa" w:w="3600"/>
-            <w:shd w:fill="F4F1EA" w:color="auto" w:val="clear"/>
-            <w:tcMar>
-              <w:top w:type="dxa" w:w="80"/>
-              <w:left w:type="dxa" w:w="100"/>
-              <w:bottom w:type="dxa" w:w="80"/>
-              <w:right w:type="dxa" w:w="100"/>
-            </w:tcMar>
-            <w:vAlign w:val="center"/>
-          </w:tcPr>
-          <w:p>
-            <w:r>
-              <w:rPr>
-                <w:b w:val="false"/>
-                <w:bCs w:val="false"/>
-                <w:color w:val="2B2B2B"/>
-                <w:sz w:val="19"/>
-                <w:szCs w:val="19"/>
-              </w:rPr>
-              <w:t xml:space="preserve">Session cookie `secure` flag is false</w:t>
-            </w:r>
-          </w:p>
-        </w:tc>
-        <w:tc>
-          <w:tcPr>
-            <w:tcW w:type="dxa" w:w="4350"/>
-            <w:shd w:fill="F4F1EA" w:color="auto" w:val="clear"/>
             <w:tcMar>
               <w:top w:type="dxa" w:w="80"/>
               <w:left w:type="dxa" w:w="100"/>

</xml_diff>

<commit_message>
Fix footer newsletter sign-up posting to the wrong (push-notification) endpoint
The footer form posted to /subscribe expecting to capture an email, but
that route is the browser-push opt-in — it expects a push subscription's
{endpoint, keys}, not an email, so every address typed into the form was
silently dropped and never stored anywhere. Added a dedicated
newsletter_subscribers table and a real /newsletter-signup handler
(validates the email, redirects back with a status the footer shows
inline), distinct from push_subscriptions (browser push) and
newsletter_recipients (delivery tracking for campaigns already sent to
existing users).

Verified live: a new email is stored and redirects with ?newsletter=success,
a repeat submission is recognized as already-subscribed without a
duplicate row, and an invalid email is rejected before any insert.

Co-Authored-By: Claude Sonnet 5 <noreply@anthropic.com>
</commit_message>
<xml_diff>
--- a/docs/jkthub-platform-prd-brd-user-stories.docx
+++ b/docs/jkthub-platform-prd-brd-user-stories.docx
@@ -5615,6 +5615,19 @@
         <w:spacing w:after="90"/>
       </w:pPr>
       <w:r>
+        <w:t xml:space="preserve">Footer newsletter sign-up: captures a visitor's email into a dedicated subscriber list, separate from browser push and from delivery-tracking for campaigns already sent to existing users.</w:t>
+      </w:r>
+    </w:p>
+    <w:p>
+      <w:pPr>
+        <w:pStyle w:val="ListParagraph"/>
+        <w:numPr>
+          <w:ilvl w:val="0"/>
+          <w:numId w:val="1"/>
+        </w:numPr>
+        <w:spacing w:after="90"/>
+      </w:pPr>
+      <w:r>
         <w:t xml:space="preserve">Event pages: view, register (name/email/phone/group size) and pay via Paystack.</w:t>
       </w:r>
     </w:p>
@@ -7037,7 +7050,7 @@
                 <w:sz w:val="19"/>
                 <w:szCs w:val="19"/>
               </w:rPr>
-              <w:t xml:space="preserve">Public</w:t>
+              <w:t xml:space="preserve">Cross-cutting</w:t>
             </w:r>
           </w:p>
         </w:tc>
@@ -7061,7 +7074,7 @@
                 <w:sz w:val="19"/>
                 <w:szCs w:val="19"/>
               </w:rPr>
-              <w:t xml:space="preserve">Footer newsletter sign-up is wired to the wrong endpoint</w:t>
+              <w:t xml:space="preserve">CSRF coverage is partial</w:t>
             </w:r>
           </w:p>
         </w:tc>
@@ -7085,7 +7098,7 @@
                 <w:sz w:val="19"/>
                 <w:szCs w:val="19"/>
               </w:rPr>
-              <w:t xml:space="preserve">It posts to /subscribe, which is actually the browser-push opt-in — there is no real email-list sign-up handler behind it.</w:t>
+              <w:t xml:space="preserve">Being added router-by-router (per the project's own established pattern); some older routes remain unprotected.</w:t>
             </w:r>
           </w:p>
         </w:tc>
@@ -7137,7 +7150,7 @@
                 <w:sz w:val="19"/>
                 <w:szCs w:val="19"/>
               </w:rPr>
-              <w:t xml:space="preserve">CSRF coverage is partial</w:t>
+              <w:t xml:space="preserve">Session cookie `secure` flag is false</w:t>
             </w:r>
           </w:p>
         </w:tc>
@@ -7145,80 +7158,6 @@
           <w:tcPr>
             <w:tcW w:type="dxa" w:w="4350"/>
             <w:shd w:fill="F4F1EA" w:color="auto" w:val="clear"/>
-            <w:tcMar>
-              <w:top w:type="dxa" w:w="80"/>
-              <w:left w:type="dxa" w:w="100"/>
-              <w:bottom w:type="dxa" w:w="80"/>
-              <w:right w:type="dxa" w:w="100"/>
-            </w:tcMar>
-            <w:vAlign w:val="center"/>
-          </w:tcPr>
-          <w:p>
-            <w:r>
-              <w:rPr>
-                <w:b w:val="false"/>
-                <w:bCs w:val="false"/>
-                <w:color w:val="2B2B2B"/>
-                <w:sz w:val="19"/>
-                <w:szCs w:val="19"/>
-              </w:rPr>
-              <w:t xml:space="preserve">Being added router-by-router (per the project's own established pattern); some older routes remain unprotected.</w:t>
-            </w:r>
-          </w:p>
-        </w:tc>
-      </w:tr>
-      <w:tr>
-        <w:tc>
-          <w:tcPr>
-            <w:tcW w:type="dxa" w:w="1400"/>
-            <w:tcMar>
-              <w:top w:type="dxa" w:w="80"/>
-              <w:left w:type="dxa" w:w="100"/>
-              <w:bottom w:type="dxa" w:w="80"/>
-              <w:right w:type="dxa" w:w="100"/>
-            </w:tcMar>
-            <w:vAlign w:val="center"/>
-          </w:tcPr>
-          <w:p>
-            <w:r>
-              <w:rPr>
-                <w:b w:val="false"/>
-                <w:bCs w:val="false"/>
-                <w:color w:val="2B2B2B"/>
-                <w:sz w:val="19"/>
-                <w:szCs w:val="19"/>
-              </w:rPr>
-              <w:t xml:space="preserve">Cross-cutting</w:t>
-            </w:r>
-          </w:p>
-        </w:tc>
-        <w:tc>
-          <w:tcPr>
-            <w:tcW w:type="dxa" w:w="3600"/>
-            <w:tcMar>
-              <w:top w:type="dxa" w:w="80"/>
-              <w:left w:type="dxa" w:w="100"/>
-              <w:bottom w:type="dxa" w:w="80"/>
-              <w:right w:type="dxa" w:w="100"/>
-            </w:tcMar>
-            <w:vAlign w:val="center"/>
-          </w:tcPr>
-          <w:p>
-            <w:r>
-              <w:rPr>
-                <w:b w:val="false"/>
-                <w:bCs w:val="false"/>
-                <w:color w:val="2B2B2B"/>
-                <w:sz w:val="19"/>
-                <w:szCs w:val="19"/>
-              </w:rPr>
-              <w:t xml:space="preserve">Session cookie `secure` flag is false</w:t>
-            </w:r>
-          </w:p>
-        </w:tc>
-        <w:tc>
-          <w:tcPr>
-            <w:tcW w:type="dxa" w:w="4350"/>
             <w:tcMar>
               <w:top w:type="dxa" w:w="80"/>
               <w:left w:type="dxa" w:w="100"/>

</xml_diff>

<commit_message>
Fix /admin landing on Newsletters instead of the real dashboard
The bare /admin root rendered the Newsletters page directly — a
leftover duplicate of that page's own real route at /admin/newsletters,
which already works fine on its own. A navigation surprise on first
open. Now redirects to /admin/dashboard, the actual dashboard.

Verified live: GET /admin and /admin/ both redirect (302) to
/admin/dashboard, which loads (200), and /admin/newsletters still works
unaffected.

Co-Authored-By: Claude Sonnet 5 <noreply@anthropic.com>
</commit_message>
<xml_diff>
--- a/docs/jkthub-platform-prd-brd-user-stories.docx
+++ b/docs/jkthub-platform-prd-brd-user-stories.docx
@@ -6748,7 +6748,7 @@
                 <w:sz w:val="19"/>
                 <w:szCs w:val="19"/>
               </w:rPr>
-              <w:t xml:space="preserve">Admin</w:t>
+              <w:t xml:space="preserve">Student</w:t>
             </w:r>
           </w:p>
         </w:tc>
@@ -6772,7 +6772,7 @@
                 <w:sz w:val="19"/>
                 <w:szCs w:val="19"/>
               </w:rPr>
-              <w:t xml:space="preserve">/admin lands on Newsletters, not the dashboard</w:t>
+              <w:t xml:space="preserve">App Inventor Lab and AI Lab</w:t>
             </w:r>
           </w:p>
         </w:tc>
@@ -6796,7 +6796,7 @@
                 <w:sz w:val="19"/>
                 <w:szCs w:val="19"/>
               </w:rPr>
-              <w:t xml:space="preserve">The real dashboard lives at /admin/dashboard — a navigation surprise, not a bug, but worth fixing for first-open UX.</w:t>
+              <w:t xml:space="preserve">Both appear as cards on the Labs home page but link to pages that don't exist yet.</w:t>
             </w:r>
           </w:p>
         </w:tc>
@@ -6848,7 +6848,7 @@
                 <w:sz w:val="19"/>
                 <w:szCs w:val="19"/>
               </w:rPr>
-              <w:t xml:space="preserve">App Inventor Lab and AI Lab</w:t>
+              <w:t xml:space="preserve">Final Course Project (the third, oldest submission system)</w:t>
             </w:r>
           </w:p>
         </w:tc>
@@ -6873,7 +6873,7 @@
                 <w:sz w:val="19"/>
                 <w:szCs w:val="19"/>
               </w:rPr>
-              <w:t xml:space="preserve">Both appear as cards on the Labs home page but link to pages that don't exist yet.</w:t>
+              <w:t xml:space="preserve">Its submit handler is non-functional. Superseded by External Projects (§3.7); recommend removing the UI entry point rather than fixing dead code.</w:t>
             </w:r>
           </w:p>
         </w:tc>
@@ -6899,7 +6899,7 @@
                 <w:sz w:val="19"/>
                 <w:szCs w:val="19"/>
               </w:rPr>
-              <w:t xml:space="preserve">Student</w:t>
+              <w:t xml:space="preserve">Parent</w:t>
             </w:r>
           </w:p>
         </w:tc>
@@ -6923,7 +6923,7 @@
                 <w:sz w:val="19"/>
                 <w:szCs w:val="19"/>
               </w:rPr>
-              <w:t xml:space="preserve">Final Course Project (the third, oldest submission system)</w:t>
+              <w:t xml:space="preserve">No parent-teacher messaging surface</w:t>
             </w:r>
           </w:p>
         </w:tc>
@@ -6947,7 +6947,7 @@
                 <w:sz w:val="19"/>
                 <w:szCs w:val="19"/>
               </w:rPr>
-              <w:t xml:space="preserve">Its submit handler is non-functional. Superseded by External Projects (§3.7); recommend removing the UI entry point rather than fixing dead code.</w:t>
+              <w:t xml:space="preserve">A general direct-message API exists platform-wide, but nothing on the parent dashboard exposes it for contacting a teacher.</w:t>
             </w:r>
           </w:p>
         </w:tc>
@@ -6974,7 +6974,7 @@
                 <w:sz w:val="19"/>
                 <w:szCs w:val="19"/>
               </w:rPr>
-              <w:t xml:space="preserve">Parent</w:t>
+              <w:t xml:space="preserve">Cross-cutting</w:t>
             </w:r>
           </w:p>
         </w:tc>
@@ -6999,7 +6999,7 @@
                 <w:sz w:val="19"/>
                 <w:szCs w:val="19"/>
               </w:rPr>
-              <w:t xml:space="preserve">No parent-teacher messaging surface</w:t>
+              <w:t xml:space="preserve">CSRF coverage is partial</w:t>
             </w:r>
           </w:p>
         </w:tc>
@@ -7024,7 +7024,7 @@
                 <w:sz w:val="19"/>
                 <w:szCs w:val="19"/>
               </w:rPr>
-              <w:t xml:space="preserve">A general direct-message API exists platform-wide, but nothing on the parent dashboard exposes it for contacting a teacher.</w:t>
+              <w:t xml:space="preserve">Being added router-by-router (per the project's own established pattern); some older routes remain unprotected.</w:t>
             </w:r>
           </w:p>
         </w:tc>
@@ -7074,90 +7074,13 @@
                 <w:sz w:val="19"/>
                 <w:szCs w:val="19"/>
               </w:rPr>
-              <w:t xml:space="preserve">CSRF coverage is partial</w:t>
+              <w:t xml:space="preserve">Session cookie `secure` flag is false</w:t>
             </w:r>
           </w:p>
         </w:tc>
         <w:tc>
           <w:tcPr>
             <w:tcW w:type="dxa" w:w="4350"/>
-            <w:tcMar>
-              <w:top w:type="dxa" w:w="80"/>
-              <w:left w:type="dxa" w:w="100"/>
-              <w:bottom w:type="dxa" w:w="80"/>
-              <w:right w:type="dxa" w:w="100"/>
-            </w:tcMar>
-            <w:vAlign w:val="center"/>
-          </w:tcPr>
-          <w:p>
-            <w:r>
-              <w:rPr>
-                <w:b w:val="false"/>
-                <w:bCs w:val="false"/>
-                <w:color w:val="2B2B2B"/>
-                <w:sz w:val="19"/>
-                <w:szCs w:val="19"/>
-              </w:rPr>
-              <w:t xml:space="preserve">Being added router-by-router (per the project's own established pattern); some older routes remain unprotected.</w:t>
-            </w:r>
-          </w:p>
-        </w:tc>
-      </w:tr>
-      <w:tr>
-        <w:tc>
-          <w:tcPr>
-            <w:tcW w:type="dxa" w:w="1400"/>
-            <w:shd w:fill="F4F1EA" w:color="auto" w:val="clear"/>
-            <w:tcMar>
-              <w:top w:type="dxa" w:w="80"/>
-              <w:left w:type="dxa" w:w="100"/>
-              <w:bottom w:type="dxa" w:w="80"/>
-              <w:right w:type="dxa" w:w="100"/>
-            </w:tcMar>
-            <w:vAlign w:val="center"/>
-          </w:tcPr>
-          <w:p>
-            <w:r>
-              <w:rPr>
-                <w:b w:val="false"/>
-                <w:bCs w:val="false"/>
-                <w:color w:val="2B2B2B"/>
-                <w:sz w:val="19"/>
-                <w:szCs w:val="19"/>
-              </w:rPr>
-              <w:t xml:space="preserve">Cross-cutting</w:t>
-            </w:r>
-          </w:p>
-        </w:tc>
-        <w:tc>
-          <w:tcPr>
-            <w:tcW w:type="dxa" w:w="3600"/>
-            <w:shd w:fill="F4F1EA" w:color="auto" w:val="clear"/>
-            <w:tcMar>
-              <w:top w:type="dxa" w:w="80"/>
-              <w:left w:type="dxa" w:w="100"/>
-              <w:bottom w:type="dxa" w:w="80"/>
-              <w:right w:type="dxa" w:w="100"/>
-            </w:tcMar>
-            <w:vAlign w:val="center"/>
-          </w:tcPr>
-          <w:p>
-            <w:r>
-              <w:rPr>
-                <w:b w:val="false"/>
-                <w:bCs w:val="false"/>
-                <w:color w:val="2B2B2B"/>
-                <w:sz w:val="19"/>
-                <w:szCs w:val="19"/>
-              </w:rPr>
-              <w:t xml:space="preserve">Session cookie `secure` flag is false</w:t>
-            </w:r>
-          </w:p>
-        </w:tc>
-        <w:tc>
-          <w:tcPr>
-            <w:tcW w:type="dxa" w:w="4350"/>
-            <w:shd w:fill="F4F1EA" w:color="auto" w:val="clear"/>
             <w:tcMar>
               <w:top w:type="dxa" w:w="80"/>
               <w:left w:type="dxa" w:w="100"/>

</xml_diff>

<commit_message>
Arcade gamification foundation: score persistence, real XP, difficulty tiers, leaderboards
Every arcade game now reports its score on completion, awards real XP
(scaled by difficulty), and is tracked on a per-game leaderboard (top 10
best scores). 5 of 15 games (Math Blitz, Snake, Memory Match, Reaction
Test, Word Scramble) gain real Easy/Medium/Hard difficulty that changes
actual gameplay parameters; the other 10 report score/XP without
difficulty tiers yet.

New arcade_plays table, reportArcadeScore/getArcadeLeaderboard endpoints,
difficulty-picker UI, and an extended ArcadeEngine.overlay() that reports
scores and shows XP/best-score/rank feedback inline. Verified end-to-end
on an isolated test server (coin spend, XP award, best-score/rank/
leaderboard correctness, input validation).

BRD updated to reflect this as implemented; multiplayer/classroom-activity
mode and expanding the game roster remain not started.
</commit_message>
<xml_diff>
--- a/docs/jkthub-platform-prd-brd-user-stories.docx
+++ b/docs/jkthub-platform-prd-brd-user-stories.docx
@@ -4523,6 +4523,19 @@
     </w:p>
     <w:p>
       <w:pPr>
+        <w:pStyle w:val="ListParagraph"/>
+        <w:numPr>
+          <w:ilvl w:val="0"/>
+          <w:numId w:val="1"/>
+        </w:numPr>
+        <w:spacing w:after="90"/>
+      </w:pPr>
+      <w:r>
+        <w:t xml:space="preserve">Every game reports its score on completion, earns real XP, and is tracked on a per-game leaderboard (top 10 by best score). 5 games (Math Blitz, Snake, Memory Match, Reaction Test, Word Scramble) have selectable Easy/Medium/Hard difficulty that changes real gameplay parameters (time limits, speed, pool size); the remaining 10 report score/XP but have no difficulty tiers yet.</w:t>
+      </w:r>
+    </w:p>
+    <w:p>
+      <w:pPr>
         <w:pStyle w:val="Heading3"/>
         <w:spacing w:after="160" w:before="320"/>
       </w:pPr>
@@ -7073,7 +7086,7 @@
                 <w:sz w:val="19"/>
                 <w:szCs w:val="19"/>
               </w:rPr>
-              <w:t xml:space="preserve">Difficulty levels</w:t>
+              <w:t xml:space="preserve">Difficulty levels (partial)</w:t>
             </w:r>
           </w:p>
         </w:tc>
@@ -7097,7 +7110,7 @@
                 <w:sz w:val="19"/>
                 <w:szCs w:val="19"/>
               </w:rPr>
-              <w:t xml:space="preserve">Each arcade game gains selectable difficulty tiers (e.g. Easy/Medium/Hard) affecting question pool, time pressure, and/or scoring — currently games have no difficulty concept.</w:t>
+              <w:t xml:space="preserve">DONE for 5 of 15 games (Math Blitz, Snake, Memory Match, Reaction Test, Word Scramble) — Easy/Medium/Hard tiers change real gameplay parameters. Remaining 10 games still have no difficulty concept.</w:t>
             </w:r>
           </w:p>
         </w:tc>
@@ -7149,7 +7162,7 @@
                 <w:sz w:val="19"/>
                 <w:szCs w:val="19"/>
               </w:rPr>
-              <w:t xml:space="preserve">Deeper gamification</w:t>
+              <w:t xml:space="preserve">Deeper gamification (partial)</w:t>
             </w:r>
           </w:p>
         </w:tc>
@@ -7174,7 +7187,7 @@
                 <w:sz w:val="19"/>
                 <w:szCs w:val="19"/>
               </w:rPr>
-              <w:t xml:space="preserve">Streak bonuses, per-game leaderboards, unlockable cosmetics/badges tied to arcade performance specifically (distinct from the existing quiz/lesson XP system) — scope to be finalized.</w:t>
+              <w:t xml:space="preserve">DONE: every game now reports its score, awards real XP, and has a per-game leaderboard (top 10 by best score). NOT DONE: streak bonuses and unlockable cosmetics/badges tied specifically to arcade performance.</w:t>
             </w:r>
           </w:p>
         </w:tc>
@@ -7248,7 +7261,7 @@
                 <w:sz w:val="19"/>
                 <w:szCs w:val="19"/>
               </w:rPr>
-              <w:t xml:space="preserve">Expand beyond the current game roster with additional subject-aligned mini-games.</w:t>
+              <w:t xml:space="preserve">Not started. Expand beyond the current 15-game roster with additional subject-aligned mini-games.</w:t>
             </w:r>
           </w:p>
         </w:tc>
@@ -7325,7 +7338,7 @@
                 <w:sz w:val="19"/>
                 <w:szCs w:val="19"/>
               </w:rPr>
-              <w:t xml:space="preserve">Real-time, synchronous play so a teacher can run an arcade game live as a class activity (Kahoot-style) — the single biggest lift of this initiative, since no real-time/WebSocket infrastructure exists anywhere in the codebase today. Requires new server-side real-time plumbing, a classroom-session/room concept, and live-scoring UI, none of which currently exist.</w:t>
+              <w:t xml:space="preserve">Not started — the single biggest lift of this initiative, since no real-time/WebSocket infrastructure exists anywhere in the codebase today. Requires new server-side real-time plumbing, a classroom-session/room concept, and live-scoring UI, none of which currently exist.</w:t>
             </w:r>
           </w:p>
         </w:tc>

</xml_diff>

<commit_message>
Blockly Lab: add Scratch/PictoBlox gap blocks (Motion+Looks phase 1)
Adds turn-ccw, set-x/y, if-on-edge-bounce, rotation style + direction
reporter, think/think-for-seconds, graphic effects (color/ghost/
brightness/blur), layer ordering, and costume/backdrop/size reporters
- closing the gap against the full Scratch/PictoBlox block reference,
one category at a time. Verified live via direct runtime-function
calls against every new block/generator/engine function.

Co-Authored-By: Claude Sonnet 5 <noreply@anthropic.com>
</commit_message>
<xml_diff>
--- a/docs/jkthub-platform-prd-brd-user-stories.docx
+++ b/docs/jkthub-platform-prd-brd-user-stories.docx
@@ -3649,6 +3649,19 @@
     </w:p>
     <w:p>
       <w:pPr>
+        <w:pStyle w:val="ListParagraph"/>
+        <w:numPr>
+          <w:ilvl w:val="0"/>
+          <w:numId w:val="1"/>
+        </w:numPr>
+        <w:spacing w:after="90"/>
+      </w:pPr>
+      <w:r>
+        <w:t xml:space="preserve">Expanded block set matching Scratch/PictoBlox: turn counter-clockwise, go to x/y, if-on-edge-bounce, rotation style (left-right/don't rotate/all around) with a sprite-direction reporter; think/think-for-seconds speech bubbles, graphic effects (color/ghost/brightness/blur, change or set, clear all), layer ordering (go to front/back, go forward/backward by N), and costume/backdrop/size reporters. More categories (Events, Sensing, Pen, Sound, Music, Text-to-Speech, Translate, Video Sensing) are being filled in to close the remaining gap against the full Scratch/PictoBlox block reference.</w:t>
+      </w:r>
+    </w:p>
+    <w:p>
+      <w:pPr>
         <w:pStyle w:val="Heading3"/>
         <w:spacing w:after="160" w:before="320"/>
       </w:pPr>

</xml_diff>

<commit_message>
Admin: redesign School Details page (Phase 4: Terms tab)
Replaces the Terms tab's plain table with a card grid (name/period/
status, student count, price/plan/addons/discount/total, a clickable
payment-status pill) matching the Phases 1-3 design system. Adds a
shared Term Roster modal (replacing the old inline-expanding row) with
working Remove. Create/Edit/Assign Term forms keep every field id,
name and JS wiring unchanged, just restyled. End Term keeps its exact
data attributes so the page's resumable-polling logic still finds it.

Verified live: card rendering, roster view/remove, payment-pill
toggle, Edit Term rename actually persisting, Create Term via real
form POST, Archive actually setting archived_at — all against real DB
state, not just UI appearance.

Co-Authored-By: Claude Sonnet 5 <noreply@anthropic.com>
</commit_message>
<xml_diff>
--- a/docs/jkthub-platform-prd-brd-user-stories.docx
+++ b/docs/jkthub-platform-prd-brd-user-stories.docx
@@ -2874,6 +2874,19 @@
     </w:p>
     <w:p>
       <w:pPr>
+        <w:pStyle w:val="ListParagraph"/>
+        <w:numPr>
+          <w:ilvl w:val="0"/>
+          <w:numId w:val="1"/>
+        </w:numPr>
+        <w:spacing w:after="90"/>
+      </w:pPr>
+      <w:r>
+        <w:t xml:space="preserve">The admin School Details page's Terms tab is redesigned (Phase 4): each term is a card (student count, price/plan/addons/discount/total, a clickable payment-status pill) instead of a plain table row, with View Roster/Edit/Export/Quote PDF/End Term/Archive all as clearly labelled actions on the card. The roster view and the create/edit/assign forms keep their exact original behaviour (field-for-field), just restyled to match the new look.</w:t>
+      </w:r>
+    </w:p>
+    <w:p>
+      <w:pPr>
         <w:pStyle w:val="Heading3"/>
         <w:spacing w:after="160" w:before="320"/>
       </w:pPr>

</xml_diff>

<commit_message>
docs: track instructor leaderboard/analytics fixes, Class Reports redesign, and the new lesson-assignment+reminders feature request
Adds the newly-requested lesson-as-assignment feature (auto submission
tracking, automated email+WhatsApp reminders to school admins, platform-
admin-configurable weekly class-day scheduling) to the pending-initiatives
list as not-yet-started, and regenerates the BRD docx and status checklist
xlsx from their source data.

Co-Authored-By: Claude Sonnet 5 <noreply@anthropic.com>
</commit_message>
<xml_diff>
--- a/docs/jkthub-platform-prd-brd-user-stories.docx
+++ b/docs/jkthub-platform-prd-brd-user-stories.docx
@@ -7322,6 +7322,80 @@
           </w:p>
         </w:tc>
       </w:tr>
+      <w:tr>
+        <w:tc>
+          <w:tcPr>
+            <w:tcW w:type="dxa" w:w="1800"/>
+            <w:tcMar>
+              <w:top w:type="dxa" w:w="80"/>
+              <w:left w:type="dxa" w:w="100"/>
+              <w:bottom w:type="dxa" w:w="80"/>
+              <w:right w:type="dxa" w:w="100"/>
+            </w:tcMar>
+            <w:vAlign w:val="center"/>
+          </w:tcPr>
+          <w:p>
+            <w:r>
+              <w:rPr>
+                <w:b w:val="false"/>
+                <w:bCs w:val="false"/>
+                <w:color w:val="2B2B2B"/>
+                <w:sz w:val="19"/>
+                <w:szCs w:val="19"/>
+              </w:rPr>
+              <w:t xml:space="preserve">Instructor</w:t>
+            </w:r>
+          </w:p>
+        </w:tc>
+        <w:tc>
+          <w:tcPr>
+            <w:tcW w:type="dxa" w:w="2200"/>
+            <w:tcMar>
+              <w:top w:type="dxa" w:w="80"/>
+              <w:left w:type="dxa" w:w="100"/>
+              <w:bottom w:type="dxa" w:w="80"/>
+              <w:right w:type="dxa" w:w="100"/>
+            </w:tcMar>
+            <w:vAlign w:val="center"/>
+          </w:tcPr>
+          <w:p>
+            <w:r>
+              <w:rPr>
+                <w:b w:val="false"/>
+                <w:bCs w:val="false"/>
+                <w:color w:val="2B2B2B"/>
+                <w:sz w:val="19"/>
+                <w:szCs w:val="19"/>
+              </w:rPr>
+              <w:t xml:space="preserve">Lesson-as-assignment with auto submission-tracking and automated school-admin reminders (email + WhatsApp)</w:t>
+            </w:r>
+          </w:p>
+        </w:tc>
+        <w:tc>
+          <w:tcPr>
+            <w:tcW w:type="dxa" w:w="5350"/>
+            <w:tcMar>
+              <w:top w:type="dxa" w:w="80"/>
+              <w:left w:type="dxa" w:w="100"/>
+              <w:bottom w:type="dxa" w:w="80"/>
+              <w:right w:type="dxa" w:w="100"/>
+            </w:tcMar>
+            <w:vAlign w:val="center"/>
+          </w:tcPr>
+          <w:p>
+            <w:r>
+              <w:rPr>
+                <w:b w:val="false"/>
+                <w:bCs w:val="false"/>
+                <w:color w:val="2B2B2B"/>
+                <w:sz w:val="19"/>
+                <w:szCs w:val="19"/>
+              </w:rPr>
+              <w:t xml:space="preserve">Not started — requested feature. An instructor would assign one or more lessons (quiz and/or other in-lesson tasks) as homework/classwork; the system auto-tracks which students have completed/submitted it, and auto-reminds the SCHOOL ADMIN by email and WhatsApp before the school's next weekly class. Requires a new platform-admin setting for each school's weekly class day(s), so the system knows when 'before the next class' falls. Email send infrastructure already exists and is reused elsewhere (Brevo-backed, already used by the assignment-reminder cron job); WhatsApp send infrastructure is completely new — no package, code or credentials exist anywhere in the codebase yet, so a provider choice and real credentials are needed before this can be built. Needs its own design pass before implementation.</w:t>
+            </w:r>
+          </w:p>
+        </w:tc>
+      </w:tr>
     </w:tbl>
     <w:p>
       <w:r>

</xml_diff>

<commit_message>
docs: track expanded lesson-task reminder recipients in BRD/checklist
Now reflects 4 recipient groups (school admin + platform admin CC,
teachers, parents) and the 4-placeholder WhatsApp template.

Co-Authored-By: Claude Sonnet 5 <noreply@anthropic.com>
</commit_message>
<xml_diff>
--- a/docs/jkthub-platform-prd-brd-user-stories.docx
+++ b/docs/jkthub-platform-prd-brd-user-stories.docx
@@ -7367,7 +7367,7 @@
                 <w:sz w:val="19"/>
                 <w:szCs w:val="19"/>
               </w:rPr>
-              <w:t xml:space="preserve">Lesson-as-assignment with auto submission-tracking and automated school-admin reminders (email + WhatsApp)</w:t>
+              <w:t xml:space="preserve">Lesson-as-assignment with auto submission-tracking and automated reminders to school admin, platform admin, teachers and parents (email + WhatsApp)</w:t>
             </w:r>
           </w:p>
         </w:tc>
@@ -7391,7 +7391,7 @@
                 <w:sz w:val="19"/>
                 <w:szCs w:val="19"/>
               </w:rPr>
-              <w:t xml:space="preserve">Partially done. Shipped: platform admin sets each school's weekly class day(s); instructors bundle one or more lessons (quiz and/or lab) as a classroom task via a new Lesson Tasks tab, with a live per-student completion table; a daily job reminds the school admin by email 2 days before the school's next class for any task that isn't fully complete yet (verified with a real send). NOT done: WhatsApp isn't actually sending yet — the code calls Meta's Cloud API correctly and fails soft, but needs a real Meta Business/WhatsApp Business account, an approved message template and live credentials from the client before messages can go out.</w:t>
+              <w:t xml:space="preserve">Partially done. Shipped: platform admin sets each school's weekly class day(s); instructors bundle one or more lessons (quiz and/or lab) as a classroom task via a new Lesson Tasks tab, with a live per-student completion table; a daily job reminds 4 recipient groups by email 2 days before the school's next class for any task that isn't fully complete yet — the school admin (CC'ing every platform admin), every teacher assigned to a classroom with something pending (one combined email per teacher), and every parent whose own child specifically hasn't finished (never a parent whose child already finished) — each with a link to a real status page for their role. Verified with real sends. NOT done: WhatsApp isn't actually sending yet — the code calls Meta's Cloud API correctly for all 4 recipient groups and fails soft, but needs a real Meta Business/WhatsApp Business account, an approved 4-placeholder message template and live credentials from the client before messages can go out.</w:t>
             </w:r>
           </w:p>
         </w:tc>

</xml_diff>

<commit_message>
docs: track the new instructor Student View feature in BRD/checklist
Co-Authored-By: Claude Sonnet 5 <noreply@anthropic.com>
</commit_message>
<xml_diff>
--- a/docs/jkthub-platform-prd-brd-user-stories.docx
+++ b/docs/jkthub-platform-prd-brd-user-stories.docx
@@ -7367,6 +7367,82 @@
                 <w:sz w:val="19"/>
                 <w:szCs w:val="19"/>
               </w:rPr>
+              <w:t xml:space="preserve">"Student View" on Assigned Courses — preview a course exactly as a real student sees it</w:t>
+            </w:r>
+          </w:p>
+        </w:tc>
+        <w:tc>
+          <w:tcPr>
+            <w:tcW w:type="dxa" w:w="5350"/>
+            <w:tcMar>
+              <w:top w:type="dxa" w:w="80"/>
+              <w:left w:type="dxa" w:w="100"/>
+              <w:bottom w:type="dxa" w:w="80"/>
+              <w:right w:type="dxa" w:w="100"/>
+            </w:tcMar>
+            <w:vAlign w:val="center"/>
+          </w:tcPr>
+          <w:p>
+            <w:r>
+              <w:rPr>
+                <w:b w:val="false"/>
+                <w:bCs w:val="false"/>
+                <w:color w:val="2B2B2B"/>
+                <w:sz w:val="19"/>
+                <w:szCs w:val="19"/>
+              </w:rPr>
+              <w:t xml:space="preserve">Done. A new "Student View" button alongside the existing "Teach" button, scoped to a classroom the instructor actually teaches. Deliberately reuses the real student dashboard route/controller/template (not a separate lookalike), so every module and lesson shows exactly as a student would see it — video, text, and a fully interactive quiz with real scoring and AI feedback — with nothing persisted under the instructor's own account (verified: zero new quiz/progress/activity rows after a full real quiz submission, while a real student's identical flow still writes everything correctly). The lesson's lab task shows its inline description only; launching the real lab editor is a separate, later piece of work.</w:t>
+            </w:r>
+          </w:p>
+        </w:tc>
+      </w:tr>
+      <w:tr>
+        <w:tc>
+          <w:tcPr>
+            <w:tcW w:type="dxa" w:w="1800"/>
+            <w:shd w:fill="F4F1EA" w:color="auto" w:val="clear"/>
+            <w:tcMar>
+              <w:top w:type="dxa" w:w="80"/>
+              <w:left w:type="dxa" w:w="100"/>
+              <w:bottom w:type="dxa" w:w="80"/>
+              <w:right w:type="dxa" w:w="100"/>
+            </w:tcMar>
+            <w:vAlign w:val="center"/>
+          </w:tcPr>
+          <w:p>
+            <w:r>
+              <w:rPr>
+                <w:b w:val="false"/>
+                <w:bCs w:val="false"/>
+                <w:color w:val="2B2B2B"/>
+                <w:sz w:val="19"/>
+                <w:szCs w:val="19"/>
+              </w:rPr>
+              <w:t xml:space="preserve">Instructor</w:t>
+            </w:r>
+          </w:p>
+        </w:tc>
+        <w:tc>
+          <w:tcPr>
+            <w:tcW w:type="dxa" w:w="2200"/>
+            <w:shd w:fill="F4F1EA" w:color="auto" w:val="clear"/>
+            <w:tcMar>
+              <w:top w:type="dxa" w:w="80"/>
+              <w:left w:type="dxa" w:w="100"/>
+              <w:bottom w:type="dxa" w:w="80"/>
+              <w:right w:type="dxa" w:w="100"/>
+            </w:tcMar>
+            <w:vAlign w:val="center"/>
+          </w:tcPr>
+          <w:p>
+            <w:r>
+              <w:rPr>
+                <w:b w:val="false"/>
+                <w:bCs w:val="false"/>
+                <w:color w:val="2B2B2B"/>
+                <w:sz w:val="19"/>
+                <w:szCs w:val="19"/>
+              </w:rPr>
               <w:t xml:space="preserve">Lesson-as-assignment with auto submission-tracking and automated reminders to school admin, platform admin, teachers and parents (email + WhatsApp)</w:t>
             </w:r>
           </w:p>
@@ -7374,6 +7450,7 @@
         <w:tc>
           <w:tcPr>
             <w:tcW w:type="dxa" w:w="5350"/>
+            <w:shd w:fill="F4F1EA" w:color="auto" w:val="clear"/>
             <w:tcMar>
               <w:top w:type="dxa" w:w="80"/>
               <w:left w:type="dxa" w:w="100"/>

</xml_diff>

<commit_message>
docs: mark Arcade difficulty levels complete for all 15 games
</commit_message>
<xml_diff>
--- a/docs/jkthub-platform-prd-brd-user-stories.docx
+++ b/docs/jkthub-platform-prd-brd-user-stories.docx
@@ -7065,7 +7065,7 @@
                 <w:sz w:val="19"/>
                 <w:szCs w:val="19"/>
               </w:rPr>
-              <w:t xml:space="preserve">Difficulty levels (partial)</w:t>
+              <w:t xml:space="preserve">Difficulty levels</w:t>
             </w:r>
           </w:p>
         </w:tc>
@@ -7089,7 +7089,7 @@
                 <w:sz w:val="19"/>
                 <w:szCs w:val="19"/>
               </w:rPr>
-              <w:t xml:space="preserve">DONE for 5 of 15 games (Math Blitz, Snake, Memory Match, Reaction Test, Word Scramble) — Easy/Medium/Hard tiers change real gameplay parameters. Remaining 10 games still have no difficulty concept.</w:t>
+              <w:t xml:space="preserve">Done. All 15 of 15 games now have Easy/Medium/Hard tiers that change real gameplay parameters (spawn rates, physics speed, timers, AI search depth/random-move chance, etc.), picked via a picker shown before launch for every game.</w:t>
             </w:r>
           </w:p>
         </w:tc>

</xml_diff>

<commit_message>
docs: mark Blockly Lab Phase 3 (Pen/Sensing gaps, costumes) complete
Also commits the Scratch/PictoBlox block reference doc that has been
driving this expansion since Phase 1, previously left untracked.

Co-Authored-By: Claude Sonnet 5 <noreply@anthropic.com>
</commit_message>
<xml_diff>
--- a/docs/jkthub-platform-prd-brd-user-stories.docx
+++ b/docs/jkthub-platform-prd-brd-user-stories.docx
@@ -3683,7 +3683,20 @@
         <w:spacing w:after="90"/>
       </w:pPr>
       <w:r>
-        <w:t xml:space="preserve">More Events/Sensing blocks: broadcast-and-wait (genuinely pauses the script until every listener finishes, not just fire-and-forget); 'when backdrop switches to' and 'when timer &gt; value' triggers; touching/distance-to a specific named sprite and to the mouse pointer; a generic '[attribute] of [sprite]' reporter (position, direction, size, costume name, visible?); current date/time, days-since-2000, and the logged-in student's own username as reporters. Remaining categories (Pen extras, Sound, Music, Text-to-Speech, Translate, Video Sensing, touching-color) are being filled in to close the rest of the gap against the full Scratch/PictoBlox block reference.</w:t>
+        <w:t xml:space="preserve">More Events/Sensing blocks: broadcast-and-wait (genuinely pauses the script until every listener finishes, not just fire-and-forget); 'when backdrop switches to' and 'when timer &gt; value' triggers; touching/distance-to a specific named sprite and to the mouse pointer; a generic '[attribute] of [sprite]' reporter (position, direction, size, costume name, visible?); current date/time, days-since-2000, and the logged-in student's own username as reporters.</w:t>
+      </w:r>
+    </w:p>
+    <w:p>
+      <w:pPr>
+        <w:pStyle w:val="ListParagraph"/>
+        <w:numPr>
+          <w:ilvl w:val="0"/>
+          <w:numId w:val="1"/>
+        </w:numPr>
+        <w:spacing w:after="90"/>
+      </w:pPr>
+      <w:r>
+        <w:t xml:space="preserve">Pen/Sensing/Looks gap blocks: stamp, change pen color by, and generic set/change pen [color/saturation/brightness/transparency] (pen's color model is now a real HSV-style quad instead of 4 fixed swatches, with the legacy swatch block mapped onto it so both share one source of truth); touching color [swatch]? (samples a composited offscreen snapshot of backdrop+pen layer+every other sprite, reusing the same drawing helpers already built for Screenshot/Record); set drag mode [draggable/not draggable]. Sprites now have a true per-sprite costume list (switch costume to / next costume, plus an in-editor "+ Add Costume" picker reusing the existing sprite-asset modal) instead of one fixed image — costume name now reports correctly instead of the sprite's name. Remaining categories (Sound, Music, Text-to-Speech, Translate, Video Sensing) still need their own new infrastructure (sound assets, mic/webcam access, a translation API) and haven't been started.</w:t>
       </w:r>
     </w:p>
     <w:p>

</xml_diff>

<commit_message>
docs: track Blockly Lab Phase 4 (Text to Speech) in BRD/checklist
Co-Authored-By: Claude Sonnet 5 <noreply@anthropic.com>
</commit_message>
<xml_diff>
--- a/docs/jkthub-platform-prd-brd-user-stories.docx
+++ b/docs/jkthub-platform-prd-brd-user-stories.docx
@@ -3696,7 +3696,20 @@
         <w:spacing w:after="90"/>
       </w:pPr>
       <w:r>
-        <w:t xml:space="preserve">Pen/Sensing/Looks gap blocks: stamp, change pen color by, and generic set/change pen [color/saturation/brightness/transparency] (pen's color model is now a real HSV-style quad instead of 4 fixed swatches, with the legacy swatch block mapped onto it so both share one source of truth); touching color [swatch]? (samples a composited offscreen snapshot of backdrop+pen layer+every other sprite, reusing the same drawing helpers already built for Screenshot/Record); set drag mode [draggable/not draggable]. Sprites now have a true per-sprite costume list (switch costume to / next costume, plus an in-editor "+ Add Costume" picker reusing the existing sprite-asset modal) instead of one fixed image — costume name now reports correctly instead of the sprite's name. 'Switch costume to' is a real dropdown of that sprite's own costume names (recomputed every time it's opened), not free-typed text. An admin can also pre-attach costumes to a sprite in /admin/lab-assets — a student adding that sprite gets those costumes already on it, on top of whatever they add themselves. Remaining categories (Sound, Music, Text-to-Speech, Translate, Video Sensing) still need their own new infrastructure (sound assets, mic/webcam access, a translation API) and haven't been started.</w:t>
+        <w:t xml:space="preserve">Pen/Sensing/Looks gap blocks: stamp, change pen color by, and generic set/change pen [color/saturation/brightness/transparency] (pen's color model is now a real HSV-style quad instead of 4 fixed swatches, with the legacy swatch block mapped onto it so both share one source of truth); touching color [swatch]? (samples a composited offscreen snapshot of backdrop+pen layer+every other sprite, reusing the same drawing helpers already built for Screenshot/Record); set drag mode [draggable/not draggable]. Sprites now have a true per-sprite costume list (switch costume to / next costume, plus an in-editor "+ Add Costume" picker reusing the existing sprite-asset modal) instead of one fixed image — costume name now reports correctly instead of the sprite's name. 'Switch costume to' is a real dropdown of that sprite's own costume names (recomputed every time it's opened), not free-typed text. An admin can also pre-attach costumes to a sprite in /admin/lab-assets — a student adding that sprite gets those costumes already on it, on top of whatever they add themselves.</w:t>
+      </w:r>
+    </w:p>
+    <w:p>
+      <w:pPr>
+        <w:pStyle w:val="ListParagraph"/>
+        <w:numPr>
+          <w:ilvl w:val="0"/>
+          <w:numId w:val="1"/>
+        </w:numPr>
+        <w:spacing w:after="90"/>
+      </w:pPr>
+      <w:r>
+        <w:t xml:space="preserve">Text to Speech: speak, set voice to, set language to — uses the browser's own SpeechSynthesis API (no API key, no external service, works offline). Speak blocks the script until the speech finishes, matching Scratch/PictoBlox's own behavior; the voice picker is a dynamic dropdown of whatever voices the browser actually has installed. Remaining categories (Sound, Music, Translate, Video Sensing) still need their own new infrastructure (sound assets, a translation API key from the client, mic/webcam access) and haven't been started.</w:t>
       </w:r>
     </w:p>
     <w:p>

</xml_diff>

<commit_message>
docs: track Blockly Lab Phase 5 (Sound + Music) in BRD/checklist
Co-Authored-By: Claude Sonnet 5 <noreply@anthropic.com>
</commit_message>
<xml_diff>
--- a/docs/jkthub-platform-prd-brd-user-stories.docx
+++ b/docs/jkthub-platform-prd-brd-user-stories.docx
@@ -3709,7 +3709,33 @@
         <w:spacing w:after="90"/>
       </w:pPr>
       <w:r>
-        <w:t xml:space="preserve">Text to Speech: speak, set voice to, set language to — uses the browser's own SpeechSynthesis API (no API key, no external service, works offline). Speak blocks the script until the speech finishes, matching Scratch/PictoBlox's own behavior; the voice picker is a dynamic dropdown of whatever voices the browser actually has installed. Remaining categories (Sound, Music, Translate, Video Sensing) still need their own new infrastructure (sound assets, a translation API key from the client, mic/webcam access) and haven't been started.</w:t>
+        <w:t xml:space="preserve">Text to Speech: speak, set voice to, set language to — uses the browser's own SpeechSynthesis API (no API key, no external service, works offline). Speak blocks the script until the speech finishes, matching Scratch/PictoBlox's own behavior; the voice picker is a dynamic dropdown of whatever voices the browser actually has installed.</w:t>
+      </w:r>
+    </w:p>
+    <w:p>
+      <w:pPr>
+        <w:pStyle w:val="ListParagraph"/>
+        <w:numPr>
+          <w:ilvl w:val="0"/>
+          <w:numId w:val="1"/>
+        </w:numPr>
+        <w:spacing w:after="90"/>
+      </w:pPr>
+      <w:r>
+        <w:t xml:space="preserve">Sound: start sound / play sound until done / stop all sounds, volume (set/change/report), and pitch/pan effects — on real audio clips attached to a sprite (admin pre-attached via /admin/lab-assets, same pattern as costumes, and/or a student's own upload via a new "+ Add Sound"). Playback runs through a Web Audio gain+pan chain; pitch is a playbackRate approximation. "Play until done" genuinely blocks the script; "start sound" doesn't.</w:t>
+      </w:r>
+    </w:p>
+    <w:p>
+      <w:pPr>
+        <w:pStyle w:val="ListParagraph"/>
+        <w:numPr>
+          <w:ilvl w:val="0"/>
+          <w:numId w:val="1"/>
+        </w:numPr>
+        <w:spacing w:after="90"/>
+      </w:pPr>
+      <w:r>
+        <w:t xml:space="preserve">Music: play drum / play note / rest, set instrument, and tempo (set/change/report) — synthesized with Web Audio oscillators and filtered noise bursts rather than real sampled instruments (avoids needing to source/host/license a sample library, the same approach already used by the student dashboard's quiz chime sounds). Remaining categories (Translate, Video Sensing) still need their own new infrastructure (a translation API key from the client, webcam access) and haven't been started.</w:t>
       </w:r>
     </w:p>
     <w:p>

</xml_diff>

<commit_message>
docs: track Blockly Lab Phase 6 (Video Sensing) in BRD/checklist
Co-Authored-By: Claude Sonnet 5 <noreply@anthropic.com>
</commit_message>
<xml_diff>
--- a/docs/jkthub-platform-prd-brd-user-stories.docx
+++ b/docs/jkthub-platform-prd-brd-user-stories.docx
@@ -3735,7 +3735,20 @@
         <w:spacing w:after="90"/>
       </w:pPr>
       <w:r>
-        <w:t xml:space="preserve">Music: play drum / play note / rest, set instrument, and tempo (set/change/report) — synthesized with Web Audio oscillators and filtered noise bursts rather than real sampled instruments (avoids needing to source/host/license a sample library, the same approach already used by the student dashboard's quiz chime sounds). Remaining categories (Translate, Video Sensing) still need their own new infrastructure (a translation API key from the client, webcam access) and haven't been started.</w:t>
+        <w:t xml:space="preserve">Music: play drum / play note / rest, set instrument, and tempo (set/change/report) — synthesized with Web Audio oscillators and filtered noise bursts rather than real sampled instruments (avoids needing to source/host/license a sample library, the same approach already used by the student dashboard's quiz chime sounds).</w:t>
+      </w:r>
+    </w:p>
+    <w:p>
+      <w:pPr>
+        <w:pStyle w:val="ListParagraph"/>
+        <w:numPr>
+          <w:ilvl w:val="0"/>
+          <w:numId w:val="1"/>
+        </w:numPr>
+        <w:spacing w:after="90"/>
+      </w:pPr>
+      <w:r>
+        <w:t xml:space="preserve">Video Sensing: turn video on/off, set video transparency, video motion/direction on sprite or stage (reporter), and when video motion &gt; N (hat). Real webcam motion detection via getUserMedia + frame-diffing; the camera feed renders as a dynamic backdrop layer behind sprites, mirrored like a normal webcam view. Per-sprite motion is a real region-of-interest reading (that sprite's own area of the frame), not a stage-wide stand-in; video direction is a simplified approximation, not true optical flow. The camera always releases when a student leaves the lab, even if their own project never calls "turn video off." Remaining: Translate, still blocked on a translation API key from the client.</w:t>
       </w:r>
     </w:p>
     <w:p>

</xml_diff>

<commit_message>
docs: note hover tooltips on every Blockly block in the BRD
Co-Authored-By: Claude Sonnet 5 <noreply@anthropic.com>
</commit_message>
<xml_diff>
--- a/docs/jkthub-platform-prd-brd-user-stories.docx
+++ b/docs/jkthub-platform-prd-brd-user-stories.docx
@@ -3753,6 +3753,19 @@
     </w:p>
     <w:p>
       <w:pPr>
+        <w:pStyle w:val="ListParagraph"/>
+        <w:numPr>
+          <w:ilvl w:val="0"/>
+          <w:numId w:val="1"/>
+        </w:numPr>
+        <w:spacing w:after="90"/>
+      </w:pPr>
+      <w:r>
+        <w:t xml:space="preserve">Every block in the palette now shows a one-sentence description on hover (Blockly's native tooltip), matching Scratch's own help-text behavior — covers all of this lab's own custom blocks across every category, on top of the tooltips Blockly's built-in Logic/Loops/Math/Text/Lists/Functions blocks already ship with.</w:t>
+      </w:r>
+    </w:p>
+    <w:p>
+      <w:pPr>
         <w:pStyle w:val="Heading3"/>
         <w:spacing w:after="160" w:before="320"/>
       </w:pPr>

</xml_diff>

<commit_message>
Blockly Lab Phase 7: Translate
Adds the last block category from the Scratch/PictoBlox reference gap:
translate (text) to (language) and a viewer-language reporter. No paid
API key needed — calls the free MyMemory translation API through a
server-side proxy that caches results and caps text length so the
shared daily quota stretches across every student on the platform.

Co-Authored-By: Claude Sonnet 5 <noreply@anthropic.com>
</commit_message>
<xml_diff>
--- a/docs/jkthub-platform-prd-brd-user-stories.docx
+++ b/docs/jkthub-platform-prd-brd-user-stories.docx
@@ -3748,7 +3748,7 @@
         <w:spacing w:after="90"/>
       </w:pPr>
       <w:r>
-        <w:t xml:space="preserve">Video Sensing: turn video on/off, set video transparency, video motion/direction on sprite or stage (reporter), and when video motion &gt; N (hat). Real webcam motion detection via getUserMedia + frame-diffing; the camera feed renders as a dynamic backdrop layer behind sprites, mirrored like a normal webcam view. Per-sprite motion is a real region-of-interest reading (that sprite's own area of the frame), not a stage-wide stand-in; video direction is a simplified approximation, not true optical flow. The camera always releases when a student leaves the lab, even if their own project never calls "turn video off." Remaining: Translate, still blocked on a translation API key from the client.</w:t>
+        <w:t xml:space="preserve">Video Sensing: turn video on/off, set video transparency, video motion/direction on sprite or stage (reporter), and when video motion &gt; N (hat). Real webcam motion detection via getUserMedia + frame-diffing; the camera feed renders as a dynamic backdrop layer behind sprites, mirrored like a normal webcam view. Per-sprite motion is a real region-of-interest reading (that sprite's own area of the frame), not a stage-wide stand-in; video direction is a simplified approximation, not true optical flow. The camera always releases when a student leaves the lab, even if their own project never calls "turn video off."</w:t>
       </w:r>
     </w:p>
     <w:p>
@@ -3762,6 +3762,19 @@
       </w:pPr>
       <w:r>
         <w:t xml:space="preserve">Every block in the palette now shows a one-sentence description on hover (Blockly's native tooltip), matching Scratch's own help-text behavior — covers all of this lab's own custom blocks across every category, on top of the tooltips Blockly's built-in Logic/Loops/Math/Text/Lists/Functions blocks already ship with.</w:t>
+      </w:r>
+    </w:p>
+    <w:p>
+      <w:pPr>
+        <w:pStyle w:val="ListParagraph"/>
+        <w:numPr>
+          <w:ilvl w:val="0"/>
+          <w:numId w:val="1"/>
+        </w:numPr>
+        <w:spacing w:after="90"/>
+      </w:pPr>
+      <w:r>
+        <w:t xml:space="preserve">Translate: translate (text) to (language), and a viewer-language reporter — completes the full Scratch/PictoBlox block-reference gap. Calls the free MyMemory translation API (no account/paid key needed) through a small server-side proxy, which caches results and caps request length so the shared daily quota stretches further across every student on the platform; translating from English to Spanish, French, German, Italian, Portuguese, Chinese, Arabic, Hausa, Yoruba, Igbo or Swahili (lower-resource languages like Hausa/Yoruba/Igbo may translate less accurately, same honesty-flagged caveat used elsewhere for approximated features). Viewer Language reports the student's own browser locale, not the project's language.</w:t>
       </w:r>
     </w:p>
     <w:p>

</xml_diff>

<commit_message>
Fix broken emoji icons in downloaded Portfolio PDF
Puppeteer's PDF renderer bakes in whatever font glyphs are available
on the server at render time; the hosting environment has no color
emoji font, so every emoji character came out as an empty box in the
actual downloaded file (confirmed via a client screenshot), even
though the same characters render fine on-screen. Embedding a real
emoji font isn't viable either — Noto Color Emoji alone is ~25MB, and
Chromium's PDF rasterizer is independently unreliable with color-glyph
fonts in printed output.

Replaced every emoji in the Portfolio PDF template with small colored
text badges/dots (e.g. a WEB/ARDUINO/BLOCKS pill for project type, a
letter medallion for badge tier) using the same Georgia/Arial fonts
already proven to render correctly throughout the rest of the PDF.

Co-Authored-By: Claude Sonnet 5 <noreply@anthropic.com>
</commit_message>
<xml_diff>
--- a/docs/jkthub-platform-prd-brd-user-stories.docx
+++ b/docs/jkthub-platform-prd-brd-user-stories.docx
@@ -4964,6 +4964,19 @@
         <w:spacing w:after="90"/>
       </w:pPr>
       <w:r>
+        <w:t xml:space="preserve">The PDF template deliberately uses no emoji characters, only plain-text colored badges/dots (e.g. a 'WEB'/'ARDUINO'/'BLOCKS' pill for a project's type, a letter medallion for a badge tier) — a real client-reported bug showed emoji rendering as blank boxes in the actual downloaded file, because PDF generation depends on whatever font is installed on the rendering server, not the viewer's device; plain text in the same serif/sans-serif fonts already used throughout the PDF has no such dependency.</w:t>
+      </w:r>
+    </w:p>
+    <w:p>
+      <w:pPr>
+        <w:pStyle w:val="ListParagraph"/>
+        <w:numPr>
+          <w:ilvl w:val="0"/>
+          <w:numId w:val="1"/>
+        </w:numPr>
+        <w:spacing w:after="90"/>
+      </w:pPr>
+      <w:r>
         <w:t xml:space="preserve">An AI-written 2-3 paragraph overview (via the same AI primitive used for quiz/lab/project feedback) summarizing skills, courses, and projects — generated on demand (never automatically, to keep it a bounded, explicit cost), separately for the full CV and for each course. The prompt deliberately never names the student, so the exact same text is safe to reuse unredacted on the public achievement page.</w:t>
       </w:r>
     </w:p>

</xml_diff>